<commit_message>
New XLSL Sheet added
</commit_message>
<xml_diff>
--- a/Assignment 40.docx
+++ b/Assignment 40.docx
@@ -20,7 +20,7 @@
         <w:pStyle w:val="ListParagraph"/>
         <w:numPr>
           <w:ilvl w:val="0"/>
-          <w:numId w:val="1"/>
+          <w:numId w:val="9"/>
         </w:numPr>
         <w:rPr>
           <w:lang w:val="en-US"/>
@@ -44,7 +44,7 @@
         <w:pStyle w:val="ListParagraph"/>
         <w:numPr>
           <w:ilvl w:val="0"/>
-          <w:numId w:val="2"/>
+          <w:numId w:val="3"/>
         </w:numPr>
         <w:rPr>
           <w:lang w:val="en-US"/>
@@ -62,7 +62,7 @@
         <w:pStyle w:val="ListParagraph"/>
         <w:numPr>
           <w:ilvl w:val="0"/>
-          <w:numId w:val="2"/>
+          <w:numId w:val="3"/>
         </w:numPr>
         <w:rPr>
           <w:lang w:val="en-US"/>
@@ -80,7 +80,7 @@
         <w:pStyle w:val="ListParagraph"/>
         <w:numPr>
           <w:ilvl w:val="0"/>
-          <w:numId w:val="2"/>
+          <w:numId w:val="3"/>
         </w:numPr>
         <w:rPr>
           <w:lang w:val="en-US"/>
@@ -98,7 +98,7 @@
         <w:pStyle w:val="ListParagraph"/>
         <w:numPr>
           <w:ilvl w:val="0"/>
-          <w:numId w:val="4"/>
+          <w:numId w:val="1"/>
         </w:numPr>
         <w:rPr>
           <w:lang w:val="en-US"/>
@@ -116,7 +116,7 @@
         <w:pStyle w:val="ListParagraph"/>
         <w:numPr>
           <w:ilvl w:val="0"/>
-          <w:numId w:val="4"/>
+          <w:numId w:val="1"/>
         </w:numPr>
         <w:rPr>
           <w:lang w:val="en-US"/>
@@ -134,7 +134,7 @@
         <w:pStyle w:val="ListParagraph"/>
         <w:numPr>
           <w:ilvl w:val="0"/>
-          <w:numId w:val="4"/>
+          <w:numId w:val="1"/>
         </w:numPr>
         <w:rPr>
           <w:lang w:val="en-US"/>
@@ -152,7 +152,7 @@
         <w:pStyle w:val="ListParagraph"/>
         <w:numPr>
           <w:ilvl w:val="0"/>
-          <w:numId w:val="4"/>
+          <w:numId w:val="1"/>
         </w:numPr>
         <w:rPr>
           <w:lang w:val="en-US"/>
@@ -170,7 +170,7 @@
         <w:pStyle w:val="ListParagraph"/>
         <w:numPr>
           <w:ilvl w:val="0"/>
-          <w:numId w:val="4"/>
+          <w:numId w:val="1"/>
         </w:numPr>
         <w:rPr>
           <w:lang w:val="en-US"/>
@@ -197,7 +197,7 @@
         <w:pStyle w:val="ListParagraph"/>
         <w:numPr>
           <w:ilvl w:val="0"/>
-          <w:numId w:val="1"/>
+          <w:numId w:val="9"/>
         </w:numPr>
         <w:rPr>
           <w:lang w:val="en-US"/>
@@ -219,7 +219,7 @@
         <w:pStyle w:val="ListParagraph"/>
         <w:numPr>
           <w:ilvl w:val="0"/>
-          <w:numId w:val="2"/>
+          <w:numId w:val="3"/>
         </w:numPr>
         <w:rPr>
           <w:lang w:val="en-US"/>
@@ -237,7 +237,7 @@
         <w:pStyle w:val="ListParagraph"/>
         <w:numPr>
           <w:ilvl w:val="0"/>
-          <w:numId w:val="2"/>
+          <w:numId w:val="3"/>
         </w:numPr>
         <w:rPr>
           <w:lang w:val="en-US"/>
@@ -261,7 +261,7 @@
         <w:pStyle w:val="ListParagraph"/>
         <w:numPr>
           <w:ilvl w:val="0"/>
-          <w:numId w:val="2"/>
+          <w:numId w:val="3"/>
         </w:numPr>
         <w:rPr>
           <w:lang w:val="en-US"/>
@@ -285,7 +285,7 @@
         <w:pStyle w:val="ListParagraph"/>
         <w:numPr>
           <w:ilvl w:val="0"/>
-          <w:numId w:val="2"/>
+          <w:numId w:val="3"/>
         </w:numPr>
         <w:rPr>
           <w:lang w:val="en-US"/>
@@ -309,7 +309,7 @@
         <w:pStyle w:val="ListParagraph"/>
         <w:numPr>
           <w:ilvl w:val="0"/>
-          <w:numId w:val="2"/>
+          <w:numId w:val="3"/>
         </w:numPr>
         <w:rPr>
           <w:lang w:val="en-US"/>
@@ -327,7 +327,7 @@
         <w:pStyle w:val="ListParagraph"/>
         <w:numPr>
           <w:ilvl w:val="0"/>
-          <w:numId w:val="2"/>
+          <w:numId w:val="3"/>
         </w:numPr>
         <w:rPr>
           <w:lang w:val="en-US"/>
@@ -345,7 +345,7 @@
         <w:pStyle w:val="ListParagraph"/>
         <w:numPr>
           <w:ilvl w:val="0"/>
-          <w:numId w:val="2"/>
+          <w:numId w:val="3"/>
         </w:numPr>
         <w:rPr>
           <w:lang w:val="en-US"/>
@@ -363,7 +363,7 @@
         <w:pStyle w:val="ListParagraph"/>
         <w:numPr>
           <w:ilvl w:val="0"/>
-          <w:numId w:val="2"/>
+          <w:numId w:val="3"/>
         </w:numPr>
         <w:rPr>
           <w:lang w:val="en-US"/>
@@ -381,7 +381,7 @@
         <w:pStyle w:val="ListParagraph"/>
         <w:numPr>
           <w:ilvl w:val="0"/>
-          <w:numId w:val="2"/>
+          <w:numId w:val="3"/>
         </w:numPr>
         <w:rPr>
           <w:b/>
@@ -406,7 +406,7 @@
         <w:pStyle w:val="ListParagraph"/>
         <w:numPr>
           <w:ilvl w:val="0"/>
-          <w:numId w:val="2"/>
+          <w:numId w:val="3"/>
         </w:numPr>
       </w:pPr>
       <w:r>
@@ -418,7 +418,7 @@
         <w:pStyle w:val="ListParagraph"/>
         <w:numPr>
           <w:ilvl w:val="0"/>
-          <w:numId w:val="2"/>
+          <w:numId w:val="3"/>
         </w:numPr>
       </w:pPr>
       <w:r>
@@ -430,7 +430,7 @@
         <w:pStyle w:val="ListParagraph"/>
         <w:numPr>
           <w:ilvl w:val="0"/>
-          <w:numId w:val="2"/>
+          <w:numId w:val="3"/>
         </w:numPr>
       </w:pPr>
       <w:r>
@@ -442,7 +442,7 @@
         <w:pStyle w:val="ListParagraph"/>
         <w:numPr>
           <w:ilvl w:val="0"/>
-          <w:numId w:val="2"/>
+          <w:numId w:val="3"/>
         </w:numPr>
       </w:pPr>
       <w:r>
@@ -457,7 +457,7 @@
         <w:pStyle w:val="ListParagraph"/>
         <w:numPr>
           <w:ilvl w:val="0"/>
-          <w:numId w:val="2"/>
+          <w:numId w:val="3"/>
         </w:numPr>
       </w:pPr>
       <w:r>
@@ -472,7 +472,7 @@
         <w:pStyle w:val="ListParagraph"/>
         <w:numPr>
           <w:ilvl w:val="0"/>
-          <w:numId w:val="2"/>
+          <w:numId w:val="3"/>
         </w:numPr>
       </w:pPr>
       <w:r>
@@ -531,7 +531,7 @@
         <w:pStyle w:val="ListParagraph"/>
         <w:numPr>
           <w:ilvl w:val="0"/>
-          <w:numId w:val="2"/>
+          <w:numId w:val="3"/>
         </w:numPr>
       </w:pPr>
       <w:r>
@@ -692,7 +692,7 @@
         <w:pStyle w:val="ListParagraph"/>
         <w:numPr>
           <w:ilvl w:val="0"/>
-          <w:numId w:val="2"/>
+          <w:numId w:val="3"/>
         </w:numPr>
       </w:pPr>
       <w:r>
@@ -704,7 +704,7 @@
         <w:pStyle w:val="ListParagraph"/>
         <w:numPr>
           <w:ilvl w:val="0"/>
-          <w:numId w:val="2"/>
+          <w:numId w:val="3"/>
         </w:numPr>
       </w:pPr>
       <w:r>
@@ -716,7 +716,7 @@
         <w:pStyle w:val="ListParagraph"/>
         <w:numPr>
           <w:ilvl w:val="0"/>
-          <w:numId w:val="2"/>
+          <w:numId w:val="3"/>
         </w:numPr>
       </w:pPr>
       <w:r>
@@ -728,7 +728,7 @@
         <w:pStyle w:val="ListParagraph"/>
         <w:numPr>
           <w:ilvl w:val="0"/>
-          <w:numId w:val="2"/>
+          <w:numId w:val="3"/>
         </w:numPr>
       </w:pPr>
       <w:r>
@@ -740,7 +740,7 @@
         <w:pStyle w:val="ListParagraph"/>
         <w:numPr>
           <w:ilvl w:val="0"/>
-          <w:numId w:val="2"/>
+          <w:numId w:val="3"/>
         </w:numPr>
       </w:pPr>
       <w:r>
@@ -752,7 +752,7 @@
         <w:pStyle w:val="ListParagraph"/>
         <w:numPr>
           <w:ilvl w:val="0"/>
-          <w:numId w:val="2"/>
+          <w:numId w:val="3"/>
         </w:numPr>
       </w:pPr>
       <w:r>
@@ -764,7 +764,7 @@
         <w:pStyle w:val="ListParagraph"/>
         <w:numPr>
           <w:ilvl w:val="0"/>
-          <w:numId w:val="2"/>
+          <w:numId w:val="3"/>
         </w:numPr>
       </w:pPr>
       <w:r>
@@ -777,7 +777,7 @@
         <w:pStyle w:val="ListParagraph"/>
         <w:numPr>
           <w:ilvl w:val="0"/>
-          <w:numId w:val="1"/>
+          <w:numId w:val="9"/>
         </w:numPr>
       </w:pPr>
       <w:r>
@@ -1055,7 +1055,7 @@
         <w:pStyle w:val="ListParagraph"/>
         <w:numPr>
           <w:ilvl w:val="0"/>
-          <w:numId w:val="1"/>
+          <w:numId w:val="9"/>
         </w:numPr>
       </w:pPr>
       <w:r>
@@ -1067,7 +1067,7 @@
         <w:pStyle w:val="ListParagraph"/>
         <w:numPr>
           <w:ilvl w:val="0"/>
-          <w:numId w:val="2"/>
+          <w:numId w:val="3"/>
         </w:numPr>
       </w:pPr>
       <w:r>
@@ -1079,7 +1079,7 @@
         <w:pStyle w:val="ListParagraph"/>
         <w:numPr>
           <w:ilvl w:val="0"/>
-          <w:numId w:val="2"/>
+          <w:numId w:val="3"/>
         </w:numPr>
       </w:pPr>
       <w:r>
@@ -1331,7 +1331,7 @@
         <w:pStyle w:val="ListParagraph"/>
         <w:numPr>
           <w:ilvl w:val="0"/>
-          <w:numId w:val="1"/>
+          <w:numId w:val="9"/>
         </w:numPr>
       </w:pPr>
       <w:r>
@@ -1343,7 +1343,7 @@
         <w:pStyle w:val="ListParagraph"/>
         <w:numPr>
           <w:ilvl w:val="0"/>
-          <w:numId w:val="2"/>
+          <w:numId w:val="3"/>
         </w:numPr>
         <w:rPr>
           <w:b/>
@@ -1370,7 +1370,7 @@
         <w:pStyle w:val="ListParagraph"/>
         <w:numPr>
           <w:ilvl w:val="0"/>
-          <w:numId w:val="7"/>
+          <w:numId w:val="8"/>
         </w:numPr>
       </w:pPr>
       <w:r>
@@ -1389,7 +1389,7 @@
         <w:pStyle w:val="ListParagraph"/>
         <w:numPr>
           <w:ilvl w:val="1"/>
-          <w:numId w:val="7"/>
+          <w:numId w:val="8"/>
         </w:numPr>
       </w:pPr>
       <w:r>
@@ -1401,7 +1401,7 @@
         <w:pStyle w:val="ListParagraph"/>
         <w:numPr>
           <w:ilvl w:val="1"/>
-          <w:numId w:val="7"/>
+          <w:numId w:val="8"/>
         </w:numPr>
       </w:pPr>
       <w:r>
@@ -1413,7 +1413,7 @@
         <w:pStyle w:val="ListParagraph"/>
         <w:numPr>
           <w:ilvl w:val="0"/>
-          <w:numId w:val="7"/>
+          <w:numId w:val="8"/>
         </w:numPr>
       </w:pPr>
       <w:r>
@@ -1432,7 +1432,7 @@
         <w:pStyle w:val="ListParagraph"/>
         <w:numPr>
           <w:ilvl w:val="1"/>
-          <w:numId w:val="7"/>
+          <w:numId w:val="8"/>
         </w:numPr>
       </w:pPr>
       <w:r>
@@ -1444,7 +1444,7 @@
         <w:pStyle w:val="ListParagraph"/>
         <w:numPr>
           <w:ilvl w:val="0"/>
-          <w:numId w:val="7"/>
+          <w:numId w:val="8"/>
         </w:numPr>
       </w:pPr>
       <w:r>
@@ -1463,7 +1463,7 @@
         <w:pStyle w:val="ListParagraph"/>
         <w:numPr>
           <w:ilvl w:val="1"/>
-          <w:numId w:val="7"/>
+          <w:numId w:val="8"/>
         </w:numPr>
       </w:pPr>
       <w:r>
@@ -1475,7 +1475,7 @@
         <w:pStyle w:val="ListParagraph"/>
         <w:numPr>
           <w:ilvl w:val="0"/>
-          <w:numId w:val="7"/>
+          <w:numId w:val="8"/>
         </w:numPr>
       </w:pPr>
       <w:r>
@@ -1494,7 +1494,7 @@
         <w:pStyle w:val="ListParagraph"/>
         <w:numPr>
           <w:ilvl w:val="1"/>
-          <w:numId w:val="7"/>
+          <w:numId w:val="8"/>
         </w:numPr>
       </w:pPr>
       <w:r>
@@ -1506,7 +1506,7 @@
         <w:pStyle w:val="ListParagraph"/>
         <w:numPr>
           <w:ilvl w:val="0"/>
-          <w:numId w:val="7"/>
+          <w:numId w:val="8"/>
         </w:numPr>
       </w:pPr>
       <w:r>
@@ -1525,7 +1525,7 @@
         <w:pStyle w:val="ListParagraph"/>
         <w:numPr>
           <w:ilvl w:val="1"/>
-          <w:numId w:val="7"/>
+          <w:numId w:val="8"/>
         </w:numPr>
       </w:pPr>
       <w:r>
@@ -1537,7 +1537,7 @@
         <w:pStyle w:val="ListParagraph"/>
         <w:numPr>
           <w:ilvl w:val="0"/>
-          <w:numId w:val="7"/>
+          <w:numId w:val="8"/>
         </w:numPr>
       </w:pPr>
       <w:r>
@@ -1556,7 +1556,7 @@
         <w:pStyle w:val="ListParagraph"/>
         <w:numPr>
           <w:ilvl w:val="1"/>
-          <w:numId w:val="7"/>
+          <w:numId w:val="8"/>
         </w:numPr>
       </w:pPr>
       <w:r>
@@ -1574,7 +1574,7 @@
         <w:pStyle w:val="ListParagraph"/>
         <w:numPr>
           <w:ilvl w:val="0"/>
-          <w:numId w:val="2"/>
+          <w:numId w:val="3"/>
         </w:numPr>
       </w:pPr>
       <w:r>
@@ -1851,7 +1851,7 @@
         <w:pStyle w:val="ListParagraph"/>
         <w:numPr>
           <w:ilvl w:val="0"/>
-          <w:numId w:val="1"/>
+          <w:numId w:val="9"/>
         </w:numPr>
       </w:pPr>
       <w:r>
@@ -1864,7 +1864,7 @@
         <w:pStyle w:val="ListParagraph"/>
         <w:numPr>
           <w:ilvl w:val="0"/>
-          <w:numId w:val="2"/>
+          <w:numId w:val="3"/>
         </w:numPr>
       </w:pPr>
       <w:r>
@@ -1876,7 +1876,7 @@
         <w:pStyle w:val="ListParagraph"/>
         <w:numPr>
           <w:ilvl w:val="0"/>
-          <w:numId w:val="2"/>
+          <w:numId w:val="3"/>
         </w:numPr>
       </w:pPr>
       <w:r>
@@ -1903,7 +1903,7 @@
         <w:pStyle w:val="ListParagraph"/>
         <w:numPr>
           <w:ilvl w:val="0"/>
-          <w:numId w:val="8"/>
+          <w:numId w:val="5"/>
         </w:numPr>
       </w:pPr>
       <w:r>
@@ -1915,7 +1915,7 @@
         <w:pStyle w:val="ListParagraph"/>
         <w:numPr>
           <w:ilvl w:val="0"/>
-          <w:numId w:val="8"/>
+          <w:numId w:val="5"/>
         </w:numPr>
       </w:pPr>
       <w:r>
@@ -1927,7 +1927,7 @@
         <w:pStyle w:val="ListParagraph"/>
         <w:numPr>
           <w:ilvl w:val="0"/>
-          <w:numId w:val="8"/>
+          <w:numId w:val="5"/>
         </w:numPr>
       </w:pPr>
       <w:r>
@@ -1939,7 +1939,7 @@
         <w:pStyle w:val="ListParagraph"/>
         <w:numPr>
           <w:ilvl w:val="0"/>
-          <w:numId w:val="8"/>
+          <w:numId w:val="5"/>
         </w:numPr>
       </w:pPr>
       <w:r>
@@ -1951,7 +1951,7 @@
         <w:pStyle w:val="ListParagraph"/>
         <w:numPr>
           <w:ilvl w:val="0"/>
-          <w:numId w:val="8"/>
+          <w:numId w:val="5"/>
         </w:numPr>
       </w:pPr>
       <w:r>
@@ -1963,7 +1963,7 @@
         <w:pStyle w:val="ListParagraph"/>
         <w:numPr>
           <w:ilvl w:val="0"/>
-          <w:numId w:val="2"/>
+          <w:numId w:val="3"/>
         </w:numPr>
       </w:pPr>
       <w:r>
@@ -1978,7 +1978,7 @@
         <w:pStyle w:val="ListParagraph"/>
         <w:numPr>
           <w:ilvl w:val="0"/>
-          <w:numId w:val="2"/>
+          <w:numId w:val="3"/>
         </w:numPr>
       </w:pPr>
       <w:r>
@@ -1990,7 +1990,7 @@
         <w:pStyle w:val="ListParagraph"/>
         <w:numPr>
           <w:ilvl w:val="0"/>
-          <w:numId w:val="2"/>
+          <w:numId w:val="3"/>
         </w:numPr>
       </w:pPr>
       <w:r>
@@ -2010,7 +2010,7 @@
         <w:pStyle w:val="ListParagraph"/>
         <w:numPr>
           <w:ilvl w:val="0"/>
-          <w:numId w:val="2"/>
+          <w:numId w:val="3"/>
         </w:numPr>
       </w:pPr>
       <w:r>
@@ -2022,7 +2022,7 @@
         <w:pStyle w:val="ListParagraph"/>
         <w:numPr>
           <w:ilvl w:val="0"/>
-          <w:numId w:val="2"/>
+          <w:numId w:val="3"/>
         </w:numPr>
       </w:pPr>
       <w:r>
@@ -2034,7 +2034,7 @@
         <w:pStyle w:val="ListParagraph"/>
         <w:numPr>
           <w:ilvl w:val="0"/>
-          <w:numId w:val="2"/>
+          <w:numId w:val="3"/>
         </w:numPr>
       </w:pPr>
       <w:r>
@@ -2046,7 +2046,7 @@
         <w:pStyle w:val="ListParagraph"/>
         <w:numPr>
           <w:ilvl w:val="0"/>
-          <w:numId w:val="2"/>
+          <w:numId w:val="3"/>
         </w:numPr>
       </w:pPr>
       <w:r>
@@ -2058,7 +2058,7 @@
         <w:pStyle w:val="ListParagraph"/>
         <w:numPr>
           <w:ilvl w:val="0"/>
-          <w:numId w:val="2"/>
+          <w:numId w:val="3"/>
         </w:numPr>
       </w:pPr>
       <w:r>
@@ -2070,7 +2070,7 @@
         <w:pStyle w:val="ListParagraph"/>
         <w:numPr>
           <w:ilvl w:val="0"/>
-          <w:numId w:val="2"/>
+          <w:numId w:val="3"/>
         </w:numPr>
       </w:pPr>
       <w:r>
@@ -2366,7 +2366,7 @@
         <w:pStyle w:val="ListParagraph"/>
         <w:numPr>
           <w:ilvl w:val="0"/>
-          <w:numId w:val="2"/>
+          <w:numId w:val="3"/>
         </w:numPr>
       </w:pPr>
       <w:r>
@@ -2384,7 +2384,7 @@
         <w:pStyle w:val="ListParagraph"/>
         <w:numPr>
           <w:ilvl w:val="0"/>
-          <w:numId w:val="1"/>
+          <w:numId w:val="9"/>
         </w:numPr>
       </w:pPr>
       <w:r>
@@ -2396,7 +2396,7 @@
         <w:pStyle w:val="ListParagraph"/>
         <w:numPr>
           <w:ilvl w:val="0"/>
-          <w:numId w:val="2"/>
+          <w:numId w:val="3"/>
         </w:numPr>
       </w:pPr>
       <w:r>
@@ -2408,7 +2408,7 @@
         <w:pStyle w:val="ListParagraph"/>
         <w:numPr>
           <w:ilvl w:val="0"/>
-          <w:numId w:val="2"/>
+          <w:numId w:val="3"/>
         </w:numPr>
       </w:pPr>
       <w:r>
@@ -2420,7 +2420,7 @@
         <w:pStyle w:val="ListParagraph"/>
         <w:numPr>
           <w:ilvl w:val="0"/>
-          <w:numId w:val="2"/>
+          <w:numId w:val="3"/>
         </w:numPr>
       </w:pPr>
       <w:r>
@@ -2432,7 +2432,7 @@
         <w:pStyle w:val="ListParagraph"/>
         <w:numPr>
           <w:ilvl w:val="0"/>
-          <w:numId w:val="9"/>
+          <w:numId w:val="7"/>
         </w:numPr>
       </w:pPr>
       <w:r>
@@ -2444,7 +2444,7 @@
         <w:pStyle w:val="ListParagraph"/>
         <w:numPr>
           <w:ilvl w:val="0"/>
-          <w:numId w:val="9"/>
+          <w:numId w:val="7"/>
         </w:numPr>
       </w:pPr>
       <w:r>
@@ -2456,7 +2456,7 @@
         <w:pStyle w:val="ListParagraph"/>
         <w:numPr>
           <w:ilvl w:val="0"/>
-          <w:numId w:val="9"/>
+          <w:numId w:val="7"/>
         </w:numPr>
       </w:pPr>
       <w:r>
@@ -2468,7 +2468,7 @@
         <w:pStyle w:val="ListParagraph"/>
         <w:numPr>
           <w:ilvl w:val="0"/>
-          <w:numId w:val="9"/>
+          <w:numId w:val="7"/>
         </w:numPr>
       </w:pPr>
       <w:r>
@@ -2480,7 +2480,7 @@
         <w:pStyle w:val="ListParagraph"/>
         <w:numPr>
           <w:ilvl w:val="0"/>
-          <w:numId w:val="9"/>
+          <w:numId w:val="7"/>
         </w:numPr>
       </w:pPr>
       <w:r>
@@ -2493,7 +2493,7 @@
         <w:pStyle w:val="ListParagraph"/>
         <w:numPr>
           <w:ilvl w:val="0"/>
-          <w:numId w:val="2"/>
+          <w:numId w:val="3"/>
         </w:numPr>
       </w:pPr>
       <w:r>
@@ -2505,7 +2505,7 @@
         <w:pStyle w:val="ListParagraph"/>
         <w:numPr>
           <w:ilvl w:val="0"/>
-          <w:numId w:val="2"/>
+          <w:numId w:val="3"/>
         </w:numPr>
       </w:pPr>
       <w:r>
@@ -2533,7 +2533,7 @@
         <w:pStyle w:val="ListParagraph"/>
         <w:numPr>
           <w:ilvl w:val="0"/>
-          <w:numId w:val="2"/>
+          <w:numId w:val="3"/>
         </w:numPr>
       </w:pPr>
       <w:r>
@@ -2561,7 +2561,7 @@
         <w:pStyle w:val="ListParagraph"/>
         <w:numPr>
           <w:ilvl w:val="0"/>
-          <w:numId w:val="2"/>
+          <w:numId w:val="3"/>
         </w:numPr>
       </w:pPr>
       <w:r>
@@ -2573,7 +2573,7 @@
         <w:pStyle w:val="ListParagraph"/>
         <w:numPr>
           <w:ilvl w:val="0"/>
-          <w:numId w:val="2"/>
+          <w:numId w:val="3"/>
         </w:numPr>
       </w:pPr>
       <w:r>
@@ -2593,7 +2593,7 @@
         <w:pStyle w:val="ListParagraph"/>
         <w:numPr>
           <w:ilvl w:val="0"/>
-          <w:numId w:val="2"/>
+          <w:numId w:val="3"/>
         </w:numPr>
       </w:pPr>
       <w:r>
@@ -2605,7 +2605,7 @@
         <w:pStyle w:val="ListParagraph"/>
         <w:numPr>
           <w:ilvl w:val="0"/>
-          <w:numId w:val="2"/>
+          <w:numId w:val="3"/>
         </w:numPr>
       </w:pPr>
       <w:r>
@@ -2625,7 +2625,7 @@
         <w:pStyle w:val="ListParagraph"/>
         <w:numPr>
           <w:ilvl w:val="0"/>
-          <w:numId w:val="2"/>
+          <w:numId w:val="3"/>
         </w:numPr>
       </w:pPr>
       <w:r>
@@ -2637,7 +2637,7 @@
         <w:pStyle w:val="ListParagraph"/>
         <w:numPr>
           <w:ilvl w:val="0"/>
-          <w:numId w:val="2"/>
+          <w:numId w:val="3"/>
         </w:numPr>
       </w:pPr>
       <w:r>
@@ -2657,7 +2657,7 @@
         <w:pStyle w:val="ListParagraph"/>
         <w:numPr>
           <w:ilvl w:val="0"/>
-          <w:numId w:val="2"/>
+          <w:numId w:val="3"/>
         </w:numPr>
       </w:pPr>
       <w:r>
@@ -2675,7 +2675,7 @@
         <w:pStyle w:val="ListParagraph"/>
         <w:numPr>
           <w:ilvl w:val="0"/>
-          <w:numId w:val="2"/>
+          <w:numId w:val="3"/>
         </w:numPr>
       </w:pPr>
       <w:r>
@@ -2695,7 +2695,7 @@
         <w:pStyle w:val="ListParagraph"/>
         <w:numPr>
           <w:ilvl w:val="0"/>
-          <w:numId w:val="1"/>
+          <w:numId w:val="9"/>
         </w:numPr>
       </w:pPr>
       <w:r>
@@ -2707,7 +2707,7 @@
         <w:pStyle w:val="ListParagraph"/>
         <w:numPr>
           <w:ilvl w:val="0"/>
-          <w:numId w:val="2"/>
+          <w:numId w:val="3"/>
         </w:numPr>
       </w:pPr>
       <w:r>
@@ -2719,11 +2719,50 @@
         <w:pStyle w:val="ListParagraph"/>
         <w:numPr>
           <w:ilvl w:val="0"/>
-          <w:numId w:val="2"/>
+          <w:numId w:val="3"/>
         </w:numPr>
       </w:pPr>
       <w:r>
         <w:t>BDCDATA is a standard SAP structure used in BDC programs. Its main fields are PROGRAM, DYNPRO, DYNBEGIN, FNAM, and FVAL. PROGRAM stores the SAP program name, DYNPRO stores the screen number, DYNBEGIN indicates the beginning of a screen, FNAM stores the field name, and FVAL stores the value to be entered into that field.</w:t>
+      </w:r>
+    </w:p>
+    <w:p/>
+    <w:p>
+      <w:pPr>
+        <w:pStyle w:val="ListParagraph"/>
+        <w:numPr>
+          <w:ilvl w:val="0"/>
+          <w:numId w:val="9"/>
+        </w:numPr>
+      </w:pPr>
+      <w:r>
+        <w:t xml:space="preserve">What </w:t>
+      </w:r>
+      <w:proofErr w:type="gramStart"/>
+      <w:r>
+        <w:t>are</w:t>
+      </w:r>
+      <w:proofErr w:type="gramEnd"/>
+      <w:r>
+        <w:t xml:space="preserve"> PROGRAM, DYNPRO, DYNBEGIN, FNAM, and FVAL in BDCDATA?</w:t>
+      </w:r>
+    </w:p>
+    <w:p>
+      <w:pPr>
+        <w:pStyle w:val="ListParagraph"/>
+        <w:numPr>
+          <w:ilvl w:val="0"/>
+          <w:numId w:val="3"/>
+        </w:numPr>
+      </w:pPr>
+      <w:r>
+        <w:t>PROGRAM, DYNPRO</w:t>
+      </w:r>
+      <w:r>
+        <w:t xml:space="preserve">, </w:t>
+      </w:r>
+      <w:r>
+        <w:t>DYNBEGIN, FNAM, and FVAL are the key fields of the standard BDCDATA structure used to hold screen and field data for Batch Input</w:t>
       </w:r>
     </w:p>
     <w:tbl>
@@ -3067,7 +3106,7 @@
         <w:pStyle w:val="ListParagraph"/>
         <w:numPr>
           <w:ilvl w:val="0"/>
-          <w:numId w:val="2"/>
+          <w:numId w:val="3"/>
         </w:numPr>
       </w:pPr>
       <w:proofErr w:type="gramStart"/>
@@ -3084,7 +3123,7 @@
         <w:pStyle w:val="ListParagraph"/>
         <w:numPr>
           <w:ilvl w:val="0"/>
-          <w:numId w:val="2"/>
+          <w:numId w:val="3"/>
         </w:numPr>
       </w:pPr>
       <w:r>
@@ -3096,7 +3135,7 @@
         <w:pStyle w:val="ListParagraph"/>
         <w:numPr>
           <w:ilvl w:val="0"/>
-          <w:numId w:val="2"/>
+          <w:numId w:val="3"/>
         </w:numPr>
       </w:pPr>
       <w:r>
@@ -3108,7 +3147,7 @@
         <w:pStyle w:val="ListParagraph"/>
         <w:numPr>
           <w:ilvl w:val="0"/>
-          <w:numId w:val="2"/>
+          <w:numId w:val="3"/>
         </w:numPr>
       </w:pPr>
       <w:r>
@@ -3120,7 +3159,7 @@
         <w:pStyle w:val="ListParagraph"/>
         <w:numPr>
           <w:ilvl w:val="0"/>
-          <w:numId w:val="2"/>
+          <w:numId w:val="3"/>
         </w:numPr>
       </w:pPr>
       <w:r>
@@ -3130,6 +3169,124 @@
     <w:p>
       <w:pPr>
         <w:pStyle w:val="ListParagraph"/>
+        <w:numPr>
+          <w:ilvl w:val="0"/>
+          <w:numId w:val="9"/>
+        </w:numPr>
+      </w:pPr>
+      <w:r>
+        <w:lastRenderedPageBreak/>
+        <w:t>What is the role of SHDB (Transaction Recorder) in BDC?</w:t>
+      </w:r>
+    </w:p>
+    <w:p/>
+    <w:p/>
+    <w:p/>
+    <w:p/>
+    <w:p/>
+    <w:p/>
+    <w:p>
+      <w:pPr>
+        <w:rPr>
+          <w:sz w:val="28"/>
+          <w:szCs w:val="28"/>
+        </w:rPr>
+      </w:pPr>
+      <w:r>
+        <w:rPr>
+          <w:sz w:val="28"/>
+          <w:szCs w:val="28"/>
+        </w:rPr>
+        <w:t>Session method:</w:t>
+      </w:r>
+    </w:p>
+    <w:p>
+      <w:pPr>
+        <w:pStyle w:val="ListParagraph"/>
+        <w:numPr>
+          <w:ilvl w:val="0"/>
+          <w:numId w:val="10"/>
+        </w:numPr>
+      </w:pPr>
+      <w:r>
+        <w:t>What is session Method?</w:t>
+      </w:r>
+    </w:p>
+    <w:p>
+      <w:pPr>
+        <w:pStyle w:val="ListParagraph"/>
+        <w:numPr>
+          <w:ilvl w:val="0"/>
+          <w:numId w:val="3"/>
+        </w:numPr>
+      </w:pPr>
+      <w:r>
+        <w:t>The Session Method is a BDC technique in which transaction data is stored in a batch input session. The session is later executed through transaction SM35 to update the SAP database.</w:t>
+      </w:r>
+    </w:p>
+    <w:p>
+      <w:pPr>
+        <w:pStyle w:val="ListParagraph"/>
+        <w:numPr>
+          <w:ilvl w:val="0"/>
+          <w:numId w:val="3"/>
+        </w:numPr>
+      </w:pPr>
+      <w:r>
+        <w:t>Function Modules used:</w:t>
+      </w:r>
+    </w:p>
+    <w:p>
+      <w:pPr>
+        <w:pStyle w:val="ListParagraph"/>
+        <w:numPr>
+          <w:ilvl w:val="0"/>
+          <w:numId w:val="3"/>
+        </w:numPr>
+      </w:pPr>
+      <w:r>
+        <w:t>BDC_OPEN_GROUP</w:t>
+      </w:r>
+      <w:r>
+        <w:tab/>
+        <w:t>Creates and opens a session</w:t>
+      </w:r>
+    </w:p>
+    <w:p>
+      <w:pPr>
+        <w:pStyle w:val="ListParagraph"/>
+        <w:numPr>
+          <w:ilvl w:val="0"/>
+          <w:numId w:val="3"/>
+        </w:numPr>
+      </w:pPr>
+      <w:r>
+        <w:t>BDC_INSERT</w:t>
+      </w:r>
+      <w:r>
+        <w:tab/>
+        <w:t>Inserts transaction data into the session</w:t>
+      </w:r>
+    </w:p>
+    <w:p>
+      <w:pPr>
+        <w:pStyle w:val="ListParagraph"/>
+        <w:numPr>
+          <w:ilvl w:val="0"/>
+          <w:numId w:val="3"/>
+        </w:numPr>
+      </w:pPr>
+      <w:r>
+        <w:t>BDC_CLOSE_GROUP</w:t>
+      </w:r>
+      <w:r>
+        <w:tab/>
+        <w:t>Closes the session</w:t>
+      </w:r>
+    </w:p>
+    <w:p>
+      <w:pPr>
+        <w:pStyle w:val="ListParagraph"/>
         <w:ind w:left="360"/>
       </w:pPr>
     </w:p>
@@ -3138,21 +3295,2009 @@
         <w:pStyle w:val="ListParagraph"/>
         <w:numPr>
           <w:ilvl w:val="0"/>
-          <w:numId w:val="1"/>
-        </w:numPr>
-      </w:pPr>
-      <w:r>
-        <w:t xml:space="preserve">What </w:t>
+          <w:numId w:val="10"/>
+        </w:numPr>
+      </w:pPr>
+      <w:r>
+        <w:t xml:space="preserve">Why and when we go for call transaction and session </w:t>
       </w:r>
       <w:proofErr w:type="gramStart"/>
       <w:r>
-        <w:t>are</w:t>
+        <w:t>method ?</w:t>
       </w:r>
       <w:proofErr w:type="gramEnd"/>
-      <w:r>
-        <w:t xml:space="preserve"> PROGRAM, DYNPRO, DYNBEGIN, FNAM, and FVAL in BDCDATA?</w:t>
-      </w:r>
-    </w:p>
+    </w:p>
+    <w:p>
+      <w:pPr>
+        <w:pStyle w:val="ListParagraph"/>
+        <w:numPr>
+          <w:ilvl w:val="0"/>
+          <w:numId w:val="3"/>
+        </w:numPr>
+      </w:pPr>
+      <w:r>
+        <w:t>We choose the method based on the volume of data, performance requirements, and error handling needs</w:t>
+      </w:r>
+      <w:r>
+        <w:t>.</w:t>
+      </w:r>
+    </w:p>
+    <w:p>
+      <w:pPr>
+        <w:pStyle w:val="ListParagraph"/>
+        <w:numPr>
+          <w:ilvl w:val="0"/>
+          <w:numId w:val="3"/>
+        </w:numPr>
+      </w:pPr>
+      <w:r>
+        <w:t>When to use Call Transaction Method?</w:t>
+      </w:r>
+    </w:p>
+    <w:p>
+      <w:pPr>
+        <w:pStyle w:val="ListParagraph"/>
+        <w:numPr>
+          <w:ilvl w:val="0"/>
+          <w:numId w:val="3"/>
+        </w:numPr>
+      </w:pPr>
+      <w:r>
+        <w:t>Use Call Transaction when:</w:t>
+      </w:r>
+    </w:p>
+    <w:p>
+      <w:pPr>
+        <w:pStyle w:val="ListParagraph"/>
+        <w:numPr>
+          <w:ilvl w:val="0"/>
+          <w:numId w:val="3"/>
+        </w:numPr>
+      </w:pPr>
+      <w:r>
+        <w:t>The amount of data is small.</w:t>
+      </w:r>
+    </w:p>
+    <w:p>
+      <w:pPr>
+        <w:pStyle w:val="ListParagraph"/>
+        <w:numPr>
+          <w:ilvl w:val="0"/>
+          <w:numId w:val="3"/>
+        </w:numPr>
+      </w:pPr>
+      <w:r>
+        <w:t>Data needs to be processed immediately.</w:t>
+      </w:r>
+    </w:p>
+    <w:p>
+      <w:pPr>
+        <w:pStyle w:val="ListParagraph"/>
+        <w:numPr>
+          <w:ilvl w:val="0"/>
+          <w:numId w:val="3"/>
+        </w:numPr>
+      </w:pPr>
+      <w:r>
+        <w:t>Real-time processing is required.</w:t>
+      </w:r>
+    </w:p>
+    <w:p>
+      <w:pPr>
+        <w:pStyle w:val="ListParagraph"/>
+        <w:numPr>
+          <w:ilvl w:val="0"/>
+          <w:numId w:val="3"/>
+        </w:numPr>
+      </w:pPr>
+      <w:r>
+        <w:t>You want to handle errors directly in the ABAP program.</w:t>
+      </w:r>
+    </w:p>
+    <w:p>
+      <w:pPr>
+        <w:pStyle w:val="ListParagraph"/>
+        <w:ind w:left="360"/>
+      </w:pPr>
+    </w:p>
+    <w:p>
+      <w:pPr>
+        <w:pStyle w:val="ListParagraph"/>
+        <w:numPr>
+          <w:ilvl w:val="0"/>
+          <w:numId w:val="3"/>
+        </w:numPr>
+      </w:pPr>
+      <w:r>
+        <w:t>When to use Session Method?</w:t>
+      </w:r>
+    </w:p>
+    <w:p>
+      <w:pPr>
+        <w:pStyle w:val="ListParagraph"/>
+        <w:numPr>
+          <w:ilvl w:val="0"/>
+          <w:numId w:val="3"/>
+        </w:numPr>
+      </w:pPr>
+      <w:r>
+        <w:t>Use Session Method when:</w:t>
+      </w:r>
+    </w:p>
+    <w:p>
+      <w:pPr>
+        <w:pStyle w:val="ListParagraph"/>
+        <w:numPr>
+          <w:ilvl w:val="0"/>
+          <w:numId w:val="3"/>
+        </w:numPr>
+      </w:pPr>
+      <w:r>
+        <w:t>The amount of data is large (mass upload).</w:t>
+      </w:r>
+    </w:p>
+    <w:p>
+      <w:pPr>
+        <w:pStyle w:val="ListParagraph"/>
+        <w:numPr>
+          <w:ilvl w:val="0"/>
+          <w:numId w:val="3"/>
+        </w:numPr>
+      </w:pPr>
+      <w:r>
+        <w:t>You want better error handling.</w:t>
+      </w:r>
+    </w:p>
+    <w:p>
+      <w:pPr>
+        <w:pStyle w:val="ListParagraph"/>
+        <w:numPr>
+          <w:ilvl w:val="0"/>
+          <w:numId w:val="3"/>
+        </w:numPr>
+      </w:pPr>
+      <w:r>
+        <w:t>Failed records need to be reprocessed.</w:t>
+      </w:r>
+    </w:p>
+    <w:p>
+      <w:pPr>
+        <w:pStyle w:val="ListParagraph"/>
+        <w:numPr>
+          <w:ilvl w:val="0"/>
+          <w:numId w:val="3"/>
+        </w:numPr>
+      </w:pPr>
+      <w:r>
+        <w:t>Processing can be done later through SM35</w:t>
+      </w:r>
+    </w:p>
+    <w:p/>
+    <w:p>
+      <w:pPr>
+        <w:pStyle w:val="ListParagraph"/>
+        <w:numPr>
+          <w:ilvl w:val="0"/>
+          <w:numId w:val="10"/>
+        </w:numPr>
+      </w:pPr>
+      <w:proofErr w:type="spellStart"/>
+      <w:r>
+        <w:t>Differnce</w:t>
+      </w:r>
+      <w:proofErr w:type="spellEnd"/>
+      <w:r>
+        <w:t xml:space="preserve"> between session method and call transaction method?</w:t>
+      </w:r>
+    </w:p>
+    <w:tbl>
+      <w:tblPr>
+        <w:tblStyle w:val="TableGrid"/>
+        <w:tblW w:w="0" w:type="auto"/>
+        <w:tblLook w:val="04A0" w:firstRow="1" w:lastRow="0" w:firstColumn="1" w:lastColumn="0" w:noHBand="0" w:noVBand="1"/>
+      </w:tblPr>
+      <w:tblGrid>
+        <w:gridCol w:w="4079"/>
+        <w:gridCol w:w="4937"/>
+      </w:tblGrid>
+      <w:tr>
+        <w:tc>
+          <w:tcPr>
+            <w:tcW w:w="0" w:type="auto"/>
+            <w:hideMark/>
+          </w:tcPr>
+          <w:p>
+            <w:pPr>
+              <w:pStyle w:val="ListParagraph"/>
+              <w:numPr>
+                <w:ilvl w:val="0"/>
+                <w:numId w:val="3"/>
+              </w:numPr>
+              <w:spacing w:after="160" w:line="278" w:lineRule="auto"/>
+              <w:rPr>
+                <w:b/>
+                <w:bCs/>
+              </w:rPr>
+            </w:pPr>
+            <w:r>
+              <w:rPr>
+                <w:b/>
+                <w:bCs/>
+              </w:rPr>
+              <w:lastRenderedPageBreak/>
+              <w:t>Call Transaction Method</w:t>
+            </w:r>
+          </w:p>
+        </w:tc>
+        <w:tc>
+          <w:tcPr>
+            <w:tcW w:w="0" w:type="auto"/>
+            <w:hideMark/>
+          </w:tcPr>
+          <w:p>
+            <w:pPr>
+              <w:pStyle w:val="ListParagraph"/>
+              <w:numPr>
+                <w:ilvl w:val="0"/>
+                <w:numId w:val="3"/>
+              </w:numPr>
+              <w:spacing w:after="160" w:line="278" w:lineRule="auto"/>
+              <w:rPr>
+                <w:b/>
+                <w:bCs/>
+              </w:rPr>
+            </w:pPr>
+            <w:r>
+              <w:rPr>
+                <w:b/>
+                <w:bCs/>
+              </w:rPr>
+              <w:t>Session Method</w:t>
+            </w:r>
+          </w:p>
+        </w:tc>
+      </w:tr>
+      <w:tr>
+        <w:tc>
+          <w:tcPr>
+            <w:tcW w:w="0" w:type="auto"/>
+            <w:hideMark/>
+          </w:tcPr>
+          <w:p>
+            <w:pPr>
+              <w:pStyle w:val="ListParagraph"/>
+              <w:numPr>
+                <w:ilvl w:val="0"/>
+                <w:numId w:val="3"/>
+              </w:numPr>
+              <w:spacing w:after="160" w:line="278" w:lineRule="auto"/>
+            </w:pPr>
+            <w:r>
+              <w:t xml:space="preserve">Executes the transaction </w:t>
+            </w:r>
+            <w:r>
+              <w:rPr>
+                <w:b/>
+                <w:bCs/>
+              </w:rPr>
+              <w:t>immediately</w:t>
+            </w:r>
+            <w:r>
+              <w:t>.</w:t>
+            </w:r>
+          </w:p>
+        </w:tc>
+        <w:tc>
+          <w:tcPr>
+            <w:tcW w:w="0" w:type="auto"/>
+            <w:hideMark/>
+          </w:tcPr>
+          <w:p>
+            <w:pPr>
+              <w:pStyle w:val="ListParagraph"/>
+              <w:numPr>
+                <w:ilvl w:val="0"/>
+                <w:numId w:val="3"/>
+              </w:numPr>
+              <w:spacing w:after="160" w:line="278" w:lineRule="auto"/>
+            </w:pPr>
+            <w:r>
+              <w:t xml:space="preserve">Creates a </w:t>
+            </w:r>
+            <w:r>
+              <w:rPr>
+                <w:b/>
+                <w:bCs/>
+              </w:rPr>
+              <w:t>Batch Input Session</w:t>
+            </w:r>
+            <w:r>
+              <w:t xml:space="preserve"> and executes it later.</w:t>
+            </w:r>
+          </w:p>
+        </w:tc>
+      </w:tr>
+      <w:tr>
+        <w:tc>
+          <w:tcPr>
+            <w:tcW w:w="0" w:type="auto"/>
+            <w:hideMark/>
+          </w:tcPr>
+          <w:p>
+            <w:pPr>
+              <w:pStyle w:val="ListParagraph"/>
+              <w:numPr>
+                <w:ilvl w:val="0"/>
+                <w:numId w:val="3"/>
+              </w:numPr>
+              <w:spacing w:after="160" w:line="278" w:lineRule="auto"/>
+            </w:pPr>
+            <w:r>
+              <w:t xml:space="preserve">Does </w:t>
+            </w:r>
+            <w:r>
+              <w:rPr>
+                <w:b/>
+                <w:bCs/>
+              </w:rPr>
+              <w:t>not</w:t>
+            </w:r>
+            <w:r>
+              <w:t xml:space="preserve"> create a session.</w:t>
+            </w:r>
+          </w:p>
+        </w:tc>
+        <w:tc>
+          <w:tcPr>
+            <w:tcW w:w="0" w:type="auto"/>
+            <w:hideMark/>
+          </w:tcPr>
+          <w:p>
+            <w:pPr>
+              <w:pStyle w:val="ListParagraph"/>
+              <w:numPr>
+                <w:ilvl w:val="0"/>
+                <w:numId w:val="3"/>
+              </w:numPr>
+              <w:spacing w:after="160" w:line="278" w:lineRule="auto"/>
+            </w:pPr>
+            <w:r>
+              <w:t xml:space="preserve">Creates a session that is processed through </w:t>
+            </w:r>
+            <w:r>
+              <w:rPr>
+                <w:b/>
+                <w:bCs/>
+              </w:rPr>
+              <w:t>SM35</w:t>
+            </w:r>
+            <w:r>
+              <w:t>.</w:t>
+            </w:r>
+          </w:p>
+        </w:tc>
+      </w:tr>
+      <w:tr>
+        <w:tc>
+          <w:tcPr>
+            <w:tcW w:w="0" w:type="auto"/>
+            <w:hideMark/>
+          </w:tcPr>
+          <w:p>
+            <w:pPr>
+              <w:pStyle w:val="ListParagraph"/>
+              <w:numPr>
+                <w:ilvl w:val="0"/>
+                <w:numId w:val="3"/>
+              </w:numPr>
+              <w:spacing w:after="160" w:line="278" w:lineRule="auto"/>
+            </w:pPr>
+            <w:r>
+              <w:t>Faster execution.</w:t>
+            </w:r>
+          </w:p>
+        </w:tc>
+        <w:tc>
+          <w:tcPr>
+            <w:tcW w:w="0" w:type="auto"/>
+            <w:hideMark/>
+          </w:tcPr>
+          <w:p>
+            <w:pPr>
+              <w:pStyle w:val="ListParagraph"/>
+              <w:numPr>
+                <w:ilvl w:val="0"/>
+                <w:numId w:val="3"/>
+              </w:numPr>
+              <w:spacing w:after="160" w:line="278" w:lineRule="auto"/>
+            </w:pPr>
+            <w:r>
+              <w:t>Slower execution.</w:t>
+            </w:r>
+          </w:p>
+        </w:tc>
+      </w:tr>
+      <w:tr>
+        <w:tc>
+          <w:tcPr>
+            <w:tcW w:w="0" w:type="auto"/>
+            <w:hideMark/>
+          </w:tcPr>
+          <w:p>
+            <w:pPr>
+              <w:pStyle w:val="ListParagraph"/>
+              <w:numPr>
+                <w:ilvl w:val="0"/>
+                <w:numId w:val="3"/>
+              </w:numPr>
+              <w:spacing w:after="160" w:line="278" w:lineRule="auto"/>
+            </w:pPr>
+            <w:r>
+              <w:t xml:space="preserve">Suitable for </w:t>
+            </w:r>
+            <w:r>
+              <w:rPr>
+                <w:b/>
+                <w:bCs/>
+              </w:rPr>
+              <w:t>small amounts of data</w:t>
+            </w:r>
+            <w:r>
+              <w:t>.</w:t>
+            </w:r>
+          </w:p>
+        </w:tc>
+        <w:tc>
+          <w:tcPr>
+            <w:tcW w:w="0" w:type="auto"/>
+            <w:hideMark/>
+          </w:tcPr>
+          <w:p>
+            <w:pPr>
+              <w:pStyle w:val="ListParagraph"/>
+              <w:numPr>
+                <w:ilvl w:val="0"/>
+                <w:numId w:val="3"/>
+              </w:numPr>
+              <w:spacing w:after="160" w:line="278" w:lineRule="auto"/>
+            </w:pPr>
+            <w:r>
+              <w:t xml:space="preserve">Suitable for </w:t>
+            </w:r>
+            <w:r>
+              <w:rPr>
+                <w:b/>
+                <w:bCs/>
+              </w:rPr>
+              <w:t>large (mass) data uploads</w:t>
+            </w:r>
+            <w:r>
+              <w:t>.</w:t>
+            </w:r>
+          </w:p>
+        </w:tc>
+      </w:tr>
+      <w:tr>
+        <w:tc>
+          <w:tcPr>
+            <w:tcW w:w="0" w:type="auto"/>
+            <w:hideMark/>
+          </w:tcPr>
+          <w:p>
+            <w:pPr>
+              <w:pStyle w:val="ListParagraph"/>
+              <w:numPr>
+                <w:ilvl w:val="0"/>
+                <w:numId w:val="3"/>
+              </w:numPr>
+              <w:spacing w:after="160" w:line="278" w:lineRule="auto"/>
+            </w:pPr>
+            <w:r>
+              <w:t>Error handling is done within the ABAP program using BDCMSGCOLL.</w:t>
+            </w:r>
+          </w:p>
+        </w:tc>
+        <w:tc>
+          <w:tcPr>
+            <w:tcW w:w="0" w:type="auto"/>
+            <w:hideMark/>
+          </w:tcPr>
+          <w:p>
+            <w:pPr>
+              <w:pStyle w:val="ListParagraph"/>
+              <w:numPr>
+                <w:ilvl w:val="0"/>
+                <w:numId w:val="3"/>
+              </w:numPr>
+              <w:spacing w:after="160" w:line="278" w:lineRule="auto"/>
+            </w:pPr>
+            <w:r>
+              <w:t xml:space="preserve">Errors are handled and monitored in </w:t>
+            </w:r>
+            <w:r>
+              <w:rPr>
+                <w:b/>
+                <w:bCs/>
+              </w:rPr>
+              <w:t>SM35</w:t>
+            </w:r>
+            <w:r>
+              <w:t>.</w:t>
+            </w:r>
+          </w:p>
+        </w:tc>
+      </w:tr>
+      <w:tr>
+        <w:tc>
+          <w:tcPr>
+            <w:tcW w:w="0" w:type="auto"/>
+            <w:hideMark/>
+          </w:tcPr>
+          <w:p>
+            <w:pPr>
+              <w:pStyle w:val="ListParagraph"/>
+              <w:numPr>
+                <w:ilvl w:val="0"/>
+                <w:numId w:val="3"/>
+              </w:numPr>
+              <w:spacing w:after="160" w:line="278" w:lineRule="auto"/>
+            </w:pPr>
+            <w:r>
+              <w:t>Failed records are not easily reprocessed.</w:t>
+            </w:r>
+          </w:p>
+        </w:tc>
+        <w:tc>
+          <w:tcPr>
+            <w:tcW w:w="0" w:type="auto"/>
+            <w:hideMark/>
+          </w:tcPr>
+          <w:p>
+            <w:pPr>
+              <w:pStyle w:val="ListParagraph"/>
+              <w:numPr>
+                <w:ilvl w:val="0"/>
+                <w:numId w:val="3"/>
+              </w:numPr>
+              <w:spacing w:after="160" w:line="278" w:lineRule="auto"/>
+            </w:pPr>
+            <w:r>
+              <w:t xml:space="preserve">Failed records can be easily reprocessed from </w:t>
+            </w:r>
+            <w:r>
+              <w:rPr>
+                <w:b/>
+                <w:bCs/>
+              </w:rPr>
+              <w:t>SM35</w:t>
+            </w:r>
+            <w:r>
+              <w:t>.</w:t>
+            </w:r>
+          </w:p>
+        </w:tc>
+      </w:tr>
+      <w:tr>
+        <w:tc>
+          <w:tcPr>
+            <w:tcW w:w="0" w:type="auto"/>
+            <w:hideMark/>
+          </w:tcPr>
+          <w:p>
+            <w:pPr>
+              <w:pStyle w:val="ListParagraph"/>
+              <w:numPr>
+                <w:ilvl w:val="0"/>
+                <w:numId w:val="3"/>
+              </w:numPr>
+              <w:spacing w:after="160" w:line="278" w:lineRule="auto"/>
+            </w:pPr>
+            <w:r>
+              <w:t>Uses the CALL TRANSACTION statement.</w:t>
+            </w:r>
+          </w:p>
+        </w:tc>
+        <w:tc>
+          <w:tcPr>
+            <w:tcW w:w="0" w:type="auto"/>
+            <w:hideMark/>
+          </w:tcPr>
+          <w:p>
+            <w:pPr>
+              <w:pStyle w:val="ListParagraph"/>
+              <w:numPr>
+                <w:ilvl w:val="0"/>
+                <w:numId w:val="3"/>
+              </w:numPr>
+              <w:spacing w:after="160" w:line="278" w:lineRule="auto"/>
+            </w:pPr>
+            <w:r>
+              <w:t>Uses BDC_OPEN_GROUP, BDC_INSERT, and BDC_CLOSE_GROUP function modules.</w:t>
+            </w:r>
+          </w:p>
+        </w:tc>
+      </w:tr>
+      <w:tr>
+        <w:tc>
+          <w:tcPr>
+            <w:tcW w:w="0" w:type="auto"/>
+            <w:hideMark/>
+          </w:tcPr>
+          <w:p>
+            <w:pPr>
+              <w:pStyle w:val="ListParagraph"/>
+              <w:numPr>
+                <w:ilvl w:val="0"/>
+                <w:numId w:val="3"/>
+              </w:numPr>
+              <w:spacing w:after="160" w:line="278" w:lineRule="auto"/>
+            </w:pPr>
+            <w:r>
+              <w:t>Does not create a log in SM35.</w:t>
+            </w:r>
+          </w:p>
+        </w:tc>
+        <w:tc>
+          <w:tcPr>
+            <w:tcW w:w="0" w:type="auto"/>
+            <w:hideMark/>
+          </w:tcPr>
+          <w:p>
+            <w:pPr>
+              <w:pStyle w:val="ListParagraph"/>
+              <w:numPr>
+                <w:ilvl w:val="0"/>
+                <w:numId w:val="3"/>
+              </w:numPr>
+              <w:spacing w:after="160" w:line="278" w:lineRule="auto"/>
+            </w:pPr>
+            <w:r>
+              <w:t>Creates a session log in SM35.</w:t>
+            </w:r>
+          </w:p>
+        </w:tc>
+      </w:tr>
+      <w:tr>
+        <w:tc>
+          <w:tcPr>
+            <w:tcW w:w="0" w:type="auto"/>
+            <w:hideMark/>
+          </w:tcPr>
+          <w:p>
+            <w:pPr>
+              <w:pStyle w:val="ListParagraph"/>
+              <w:numPr>
+                <w:ilvl w:val="0"/>
+                <w:numId w:val="3"/>
+              </w:numPr>
+              <w:spacing w:after="160" w:line="278" w:lineRule="auto"/>
+            </w:pPr>
+            <w:r>
+              <w:t>Used for real-time processing.</w:t>
+            </w:r>
+          </w:p>
+        </w:tc>
+        <w:tc>
+          <w:tcPr>
+            <w:tcW w:w="0" w:type="auto"/>
+            <w:hideMark/>
+          </w:tcPr>
+          <w:p>
+            <w:pPr>
+              <w:pStyle w:val="ListParagraph"/>
+              <w:numPr>
+                <w:ilvl w:val="0"/>
+                <w:numId w:val="3"/>
+              </w:numPr>
+              <w:spacing w:after="160" w:line="278" w:lineRule="auto"/>
+            </w:pPr>
+            <w:r>
+              <w:t>Used for background or scheduled processing.</w:t>
+            </w:r>
+          </w:p>
+        </w:tc>
+      </w:tr>
+    </w:tbl>
+    <w:p/>
+    <w:p>
+      <w:pPr>
+        <w:pStyle w:val="ListParagraph"/>
+        <w:numPr>
+          <w:ilvl w:val="0"/>
+          <w:numId w:val="10"/>
+        </w:numPr>
+      </w:pPr>
+      <w:r>
+        <w:t>what is adva</w:t>
+      </w:r>
+      <w:r>
+        <w:t>n</w:t>
+      </w:r>
+      <w:r>
+        <w:t>tage of session method over call transaction?</w:t>
+      </w:r>
+    </w:p>
+    <w:p>
+      <w:pPr>
+        <w:pStyle w:val="ListParagraph"/>
+        <w:numPr>
+          <w:ilvl w:val="0"/>
+          <w:numId w:val="3"/>
+        </w:numPr>
+      </w:pPr>
+      <w:r>
+        <w:t>Errors are stored and can be analy</w:t>
+      </w:r>
+      <w:r>
+        <w:t>s</w:t>
+      </w:r>
+      <w:r>
+        <w:t>ed in SM35.</w:t>
+      </w:r>
+    </w:p>
+    <w:p>
+      <w:pPr>
+        <w:pStyle w:val="ListParagraph"/>
+        <w:numPr>
+          <w:ilvl w:val="0"/>
+          <w:numId w:val="3"/>
+        </w:numPr>
+      </w:pPr>
+      <w:r>
+        <w:t>Failed records can be reprocessed without running the entire program again.</w:t>
+      </w:r>
+    </w:p>
+    <w:p>
+      <w:pPr>
+        <w:pStyle w:val="ListParagraph"/>
+        <w:numPr>
+          <w:ilvl w:val="0"/>
+          <w:numId w:val="3"/>
+        </w:numPr>
+      </w:pPr>
+      <w:r>
+        <w:t>Efficient for uploading thousands of records.</w:t>
+      </w:r>
+    </w:p>
+    <w:p>
+      <w:pPr>
+        <w:pStyle w:val="ListParagraph"/>
+        <w:numPr>
+          <w:ilvl w:val="0"/>
+          <w:numId w:val="3"/>
+        </w:numPr>
+      </w:pPr>
+      <w:r>
+        <w:t>Processing logs are maintained in SM35.</w:t>
+      </w:r>
+    </w:p>
+    <w:p>
+      <w:pPr>
+        <w:pStyle w:val="ListParagraph"/>
+        <w:numPr>
+          <w:ilvl w:val="0"/>
+          <w:numId w:val="3"/>
+        </w:numPr>
+      </w:pPr>
+      <w:r>
+        <w:t>Sessions can be scheduled and processed in the background.</w:t>
+      </w:r>
+    </w:p>
+    <w:p>
+      <w:pPr>
+        <w:pStyle w:val="ListParagraph"/>
+        <w:numPr>
+          <w:ilvl w:val="0"/>
+          <w:numId w:val="3"/>
+        </w:numPr>
+      </w:pPr>
+      <w:r>
+        <w:t>If one record fails, other records in the session can still be processed.</w:t>
+      </w:r>
+    </w:p>
+    <w:p>
+      <w:pPr>
+        <w:pStyle w:val="ListParagraph"/>
+        <w:numPr>
+          <w:ilvl w:val="0"/>
+          <w:numId w:val="3"/>
+        </w:numPr>
+      </w:pPr>
+      <w:r>
+        <w:t>Developers and users can monitor session status in SM35.</w:t>
+      </w:r>
+    </w:p>
+    <w:p>
+      <w:pPr>
+        <w:pStyle w:val="ListParagraph"/>
+        <w:ind w:left="360"/>
+      </w:pPr>
+    </w:p>
+    <w:p>
+      <w:pPr>
+        <w:pStyle w:val="ListParagraph"/>
+        <w:numPr>
+          <w:ilvl w:val="0"/>
+          <w:numId w:val="10"/>
+        </w:numPr>
+      </w:pPr>
+      <w:r>
+        <w:t>T</w:t>
+      </w:r>
+      <w:r>
+        <w:t>ry to upload some record which is already created and upload using session method?</w:t>
+      </w:r>
+    </w:p>
+    <w:p>
+      <w:pPr>
+        <w:pStyle w:val="ListParagraph"/>
+        <w:numPr>
+          <w:ilvl w:val="0"/>
+          <w:numId w:val="3"/>
+        </w:numPr>
+      </w:pPr>
+      <w:r>
+        <w:t>If you try to upload a record that already exists (same primary key) using the Session Method:</w:t>
+      </w:r>
+    </w:p>
+    <w:p>
+      <w:pPr>
+        <w:pStyle w:val="ListParagraph"/>
+        <w:numPr>
+          <w:ilvl w:val="0"/>
+          <w:numId w:val="3"/>
+        </w:numPr>
+      </w:pPr>
+      <w:r>
+        <w:t xml:space="preserve">The session will process the record. </w:t>
+      </w:r>
+    </w:p>
+    <w:p>
+      <w:pPr>
+        <w:pStyle w:val="ListParagraph"/>
+        <w:numPr>
+          <w:ilvl w:val="0"/>
+          <w:numId w:val="3"/>
+        </w:numPr>
+      </w:pPr>
+      <w:r>
+        <w:t xml:space="preserve">SAP will throw an error like "Record already exists" or "Material already exists". </w:t>
+      </w:r>
+    </w:p>
+    <w:p>
+      <w:pPr>
+        <w:pStyle w:val="ListParagraph"/>
+        <w:numPr>
+          <w:ilvl w:val="0"/>
+          <w:numId w:val="3"/>
+        </w:numPr>
+      </w:pPr>
+      <w:r>
+        <w:t xml:space="preserve">That record will fail. </w:t>
+      </w:r>
+    </w:p>
+    <w:p>
+      <w:pPr>
+        <w:pStyle w:val="ListParagraph"/>
+        <w:numPr>
+          <w:ilvl w:val="0"/>
+          <w:numId w:val="3"/>
+        </w:numPr>
+      </w:pPr>
+      <w:r>
+        <w:t xml:space="preserve">The error will be stored in SM35. </w:t>
+      </w:r>
+    </w:p>
+    <w:p>
+      <w:pPr>
+        <w:pStyle w:val="ListParagraph"/>
+        <w:numPr>
+          <w:ilvl w:val="0"/>
+          <w:numId w:val="3"/>
+        </w:numPr>
+      </w:pPr>
+      <w:r>
+        <w:t>You can view the error log, correct the data, and reprocess the failed record.</w:t>
+      </w:r>
+    </w:p>
+    <w:p>
+      <w:pPr>
+        <w:pStyle w:val="ListParagraph"/>
+        <w:ind w:left="360"/>
+      </w:pPr>
+    </w:p>
+    <w:p>
+      <w:pPr>
+        <w:pStyle w:val="ListParagraph"/>
+        <w:ind w:left="360"/>
+      </w:pPr>
+    </w:p>
+    <w:p>
+      <w:pPr>
+        <w:pStyle w:val="ListParagraph"/>
+        <w:numPr>
+          <w:ilvl w:val="0"/>
+          <w:numId w:val="10"/>
+        </w:numPr>
+      </w:pPr>
+      <w:r>
+        <w:lastRenderedPageBreak/>
+        <w:t>E</w:t>
+      </w:r>
+      <w:r>
+        <w:t xml:space="preserve">xplore all </w:t>
+      </w:r>
+      <w:proofErr w:type="gramStart"/>
+      <w:r>
+        <w:t>3 session</w:t>
+      </w:r>
+      <w:proofErr w:type="gramEnd"/>
+      <w:r>
+        <w:t xml:space="preserve"> method </w:t>
+      </w:r>
+      <w:proofErr w:type="spellStart"/>
+      <w:r>
+        <w:t>funtion</w:t>
+      </w:r>
+      <w:proofErr w:type="spellEnd"/>
+      <w:r>
+        <w:t xml:space="preserve"> module?</w:t>
+      </w:r>
+    </w:p>
+    <w:p>
+      <w:pPr>
+        <w:pStyle w:val="ListParagraph"/>
+        <w:numPr>
+          <w:ilvl w:val="0"/>
+          <w:numId w:val="3"/>
+        </w:numPr>
+      </w:pPr>
+      <w:r>
+        <w:t>1. BDC_OPEN_GROUP</w:t>
+      </w:r>
+      <w:r>
+        <w:t>.</w:t>
+      </w:r>
+    </w:p>
+    <w:p>
+      <w:pPr>
+        <w:pStyle w:val="ListParagraph"/>
+        <w:numPr>
+          <w:ilvl w:val="0"/>
+          <w:numId w:val="3"/>
+        </w:numPr>
+      </w:pPr>
+      <w:r>
+        <w:t>2.BDC_</w:t>
+      </w:r>
+      <w:r>
+        <w:t>INSERT.</w:t>
+      </w:r>
+    </w:p>
+    <w:p>
+      <w:pPr>
+        <w:pStyle w:val="ListParagraph"/>
+        <w:numPr>
+          <w:ilvl w:val="0"/>
+          <w:numId w:val="3"/>
+        </w:numPr>
+      </w:pPr>
+      <w:r>
+        <w:t>3.BDC_CLOSE_GROUP.</w:t>
+      </w:r>
+      <w:r>
+        <w:br/>
+      </w:r>
+    </w:p>
+    <w:p>
+      <w:pPr>
+        <w:pStyle w:val="ListParagraph"/>
+        <w:numPr>
+          <w:ilvl w:val="0"/>
+          <w:numId w:val="3"/>
+        </w:numPr>
+        <w:rPr>
+          <w:b/>
+          <w:bCs/>
+        </w:rPr>
+      </w:pPr>
+      <w:r>
+        <w:rPr>
+          <w:b/>
+          <w:bCs/>
+        </w:rPr>
+        <w:t>1. BDC_OPEN_GROUP.</w:t>
+      </w:r>
+    </w:p>
+    <w:p>
+      <w:pPr>
+        <w:pStyle w:val="ListParagraph"/>
+        <w:numPr>
+          <w:ilvl w:val="0"/>
+          <w:numId w:val="3"/>
+        </w:numPr>
+      </w:pPr>
+      <w:r>
+        <w:t>Creates and opens a Batch Input Session.</w:t>
+      </w:r>
+    </w:p>
+    <w:p>
+      <w:pPr>
+        <w:pStyle w:val="ListParagraph"/>
+        <w:numPr>
+          <w:ilvl w:val="0"/>
+          <w:numId w:val="3"/>
+        </w:numPr>
+      </w:pPr>
+      <w:r>
+        <w:t>This is the first function module called in the Session Method.</w:t>
+      </w:r>
+    </w:p>
+    <w:p>
+      <w:pPr>
+        <w:pStyle w:val="ListParagraph"/>
+        <w:numPr>
+          <w:ilvl w:val="0"/>
+          <w:numId w:val="3"/>
+        </w:numPr>
+      </w:pPr>
+      <w:r>
+        <w:t>Syntax:</w:t>
+      </w:r>
+    </w:p>
+    <w:p>
+      <w:pPr>
+        <w:pStyle w:val="ListParagraph"/>
+        <w:ind w:left="360"/>
+      </w:pPr>
+      <w:r>
+        <w:t>CALL FUNCTION 'BDC_OPEN_GROUP'</w:t>
+      </w:r>
+    </w:p>
+    <w:p>
+      <w:pPr>
+        <w:pStyle w:val="ListParagraph"/>
+        <w:ind w:left="360"/>
+      </w:pPr>
+      <w:r>
+        <w:t xml:space="preserve">  EXPORTING</w:t>
+      </w:r>
+    </w:p>
+    <w:p>
+      <w:pPr>
+        <w:pStyle w:val="ListParagraph"/>
+        <w:ind w:left="360"/>
+      </w:pPr>
+      <w:r>
+        <w:t xml:space="preserve">    client = </w:t>
+      </w:r>
+      <w:proofErr w:type="spellStart"/>
+      <w:r>
+        <w:t>sy-mandt</w:t>
+      </w:r>
+      <w:proofErr w:type="spellEnd"/>
+      <w:r>
+        <w:t xml:space="preserve">       </w:t>
+      </w:r>
+      <w:proofErr w:type="gramStart"/>
+      <w:r>
+        <w:t xml:space="preserve">   “</w:t>
+      </w:r>
+      <w:proofErr w:type="gramEnd"/>
+      <w:r>
+        <w:t>SAP</w:t>
+      </w:r>
+      <w:r>
+        <w:t xml:space="preserve"> Client</w:t>
+      </w:r>
+      <w:r>
+        <w:t xml:space="preserve"> ex: 100.</w:t>
+      </w:r>
+    </w:p>
+    <w:p>
+      <w:pPr>
+        <w:pStyle w:val="ListParagraph"/>
+        <w:ind w:left="360"/>
+      </w:pPr>
+      <w:r>
+        <w:t xml:space="preserve">    </w:t>
+      </w:r>
+      <w:proofErr w:type="gramStart"/>
+      <w:r>
+        <w:t>group  =</w:t>
+      </w:r>
+      <w:proofErr w:type="gramEnd"/>
+      <w:r>
+        <w:t xml:space="preserve"> 'SESSION1'</w:t>
+      </w:r>
+      <w:r>
+        <w:t xml:space="preserve">   </w:t>
+      </w:r>
+      <w:proofErr w:type="gramStart"/>
+      <w:r>
+        <w:t xml:space="preserve">   “</w:t>
+      </w:r>
+      <w:proofErr w:type="gramEnd"/>
+      <w:r>
+        <w:t xml:space="preserve">session name </w:t>
+      </w:r>
+      <w:r>
+        <w:t xml:space="preserve">to </w:t>
+      </w:r>
+      <w:r>
+        <w:t xml:space="preserve">display in </w:t>
+      </w:r>
+      <w:r>
+        <w:t>SM35.</w:t>
+      </w:r>
+    </w:p>
+    <w:p>
+      <w:pPr>
+        <w:pStyle w:val="ListParagraph"/>
+        <w:ind w:left="360"/>
+      </w:pPr>
+      <w:r>
+        <w:t xml:space="preserve">    user   = </w:t>
+      </w:r>
+      <w:proofErr w:type="spellStart"/>
+      <w:r>
+        <w:t>sy-uname</w:t>
+      </w:r>
+      <w:proofErr w:type="spellEnd"/>
+      <w:r>
+        <w:t xml:space="preserve">      </w:t>
+      </w:r>
+      <w:proofErr w:type="gramStart"/>
+      <w:r>
+        <w:t xml:space="preserve">   “</w:t>
+      </w:r>
+      <w:proofErr w:type="gramEnd"/>
+      <w:r>
+        <w:t>username (Who owns the session)</w:t>
+      </w:r>
+      <w:r>
+        <w:t>.</w:t>
+      </w:r>
+    </w:p>
+    <w:p>
+      <w:pPr>
+        <w:pStyle w:val="ListParagraph"/>
+        <w:ind w:left="360"/>
+      </w:pPr>
+      <w:r>
+        <w:t xml:space="preserve">    keep   = 'X'.</w:t>
+      </w:r>
+      <w:r>
+        <w:tab/>
+        <w:t xml:space="preserve">           “</w:t>
+      </w:r>
+      <w:proofErr w:type="gramStart"/>
+      <w:r>
+        <w:t>keeps</w:t>
+      </w:r>
+      <w:proofErr w:type="gramEnd"/>
+      <w:r>
+        <w:t xml:space="preserve"> the session after </w:t>
+      </w:r>
+      <w:proofErr w:type="gramStart"/>
+      <w:r>
+        <w:t>processing(</w:t>
+      </w:r>
+      <w:proofErr w:type="gramEnd"/>
+      <w:r>
+        <w:t>X = YES).</w:t>
+      </w:r>
+    </w:p>
+    <w:p>
+      <w:pPr>
+        <w:pStyle w:val="ListParagraph"/>
+        <w:ind w:left="360"/>
+      </w:pPr>
+    </w:p>
+    <w:p>
+      <w:pPr>
+        <w:pStyle w:val="ListParagraph"/>
+        <w:numPr>
+          <w:ilvl w:val="0"/>
+          <w:numId w:val="3"/>
+        </w:numPr>
+        <w:rPr>
+          <w:b/>
+          <w:bCs/>
+        </w:rPr>
+      </w:pPr>
+      <w:r>
+        <w:rPr>
+          <w:b/>
+          <w:bCs/>
+        </w:rPr>
+        <w:t>2.BDC_INSERT.</w:t>
+      </w:r>
+    </w:p>
+    <w:p>
+      <w:pPr>
+        <w:pStyle w:val="ListParagraph"/>
+        <w:numPr>
+          <w:ilvl w:val="0"/>
+          <w:numId w:val="3"/>
+        </w:numPr>
+      </w:pPr>
+      <w:r>
+        <w:t>BDC_INSERT inserts the transaction code and BDCDATA into the Batch Input Session.</w:t>
+      </w:r>
+    </w:p>
+    <w:p>
+      <w:pPr>
+        <w:pStyle w:val="ListParagraph"/>
+        <w:numPr>
+          <w:ilvl w:val="0"/>
+          <w:numId w:val="3"/>
+        </w:numPr>
+      </w:pPr>
+      <w:r>
+        <w:t>Called inside the LOOP for every record.</w:t>
+      </w:r>
+    </w:p>
+    <w:p>
+      <w:pPr>
+        <w:pStyle w:val="ListParagraph"/>
+        <w:numPr>
+          <w:ilvl w:val="0"/>
+          <w:numId w:val="3"/>
+        </w:numPr>
+      </w:pPr>
+      <w:r>
+        <w:t>Syntax:</w:t>
+      </w:r>
+    </w:p>
+    <w:p>
+      <w:pPr>
+        <w:pStyle w:val="ListParagraph"/>
+        <w:ind w:left="360"/>
+      </w:pPr>
+      <w:r>
+        <w:t>CALL FUNCTION 'BDC_INSERT'</w:t>
+      </w:r>
+      <w:r>
+        <w:tab/>
+      </w:r>
+    </w:p>
+    <w:p>
+      <w:pPr>
+        <w:pStyle w:val="ListParagraph"/>
+        <w:ind w:left="360"/>
+      </w:pPr>
+      <w:r>
+        <w:t xml:space="preserve">  EXPORTING</w:t>
+      </w:r>
+      <w:r>
+        <w:tab/>
+      </w:r>
+      <w:r>
+        <w:tab/>
+      </w:r>
+      <w:r>
+        <w:tab/>
+      </w:r>
+    </w:p>
+    <w:p>
+      <w:pPr>
+        <w:pStyle w:val="ListParagraph"/>
+        <w:ind w:left="360"/>
+      </w:pPr>
+      <w:r>
+        <w:t xml:space="preserve">    </w:t>
+      </w:r>
+      <w:proofErr w:type="spellStart"/>
+      <w:r>
+        <w:t>tcode</w:t>
+      </w:r>
+      <w:proofErr w:type="spellEnd"/>
+      <w:r>
+        <w:t xml:space="preserve"> = 'MM01'</w:t>
+      </w:r>
+      <w:r>
+        <w:tab/>
+      </w:r>
+      <w:r>
+        <w:tab/>
+      </w:r>
+      <w:r>
+        <w:tab/>
+        <w:t>“</w:t>
+      </w:r>
+      <w:proofErr w:type="spellStart"/>
+      <w:r>
+        <w:t>TCodes</w:t>
+      </w:r>
+      <w:proofErr w:type="spellEnd"/>
+      <w:r>
+        <w:t xml:space="preserve"> like MM</w:t>
+      </w:r>
+      <w:proofErr w:type="gramStart"/>
+      <w:r>
+        <w:t>01,</w:t>
+      </w:r>
+      <w:r>
+        <w:t>XD</w:t>
+      </w:r>
+      <w:proofErr w:type="gramEnd"/>
+      <w:r>
+        <w:t>01 etc.</w:t>
+      </w:r>
+    </w:p>
+    <w:p>
+      <w:pPr>
+        <w:pStyle w:val="ListParagraph"/>
+        <w:ind w:left="360"/>
+      </w:pPr>
+      <w:r>
+        <w:t xml:space="preserve">  TABLES</w:t>
+      </w:r>
+      <w:r>
+        <w:tab/>
+      </w:r>
+      <w:r>
+        <w:tab/>
+      </w:r>
+      <w:r>
+        <w:tab/>
+      </w:r>
+      <w:r>
+        <w:tab/>
+      </w:r>
+    </w:p>
+    <w:p>
+      <w:pPr>
+        <w:pStyle w:val="ListParagraph"/>
+        <w:ind w:left="360"/>
+      </w:pPr>
+      <w:r>
+        <w:t xml:space="preserve">    </w:t>
+      </w:r>
+      <w:proofErr w:type="spellStart"/>
+      <w:r>
+        <w:t>dynprotab</w:t>
+      </w:r>
+      <w:proofErr w:type="spellEnd"/>
+      <w:r>
+        <w:t xml:space="preserve"> = </w:t>
+      </w:r>
+      <w:proofErr w:type="spellStart"/>
+      <w:r>
+        <w:t>lt_bdcdata</w:t>
+      </w:r>
+      <w:proofErr w:type="spellEnd"/>
+      <w:r>
+        <w:t>.</w:t>
+      </w:r>
+      <w:r>
+        <w:tab/>
+        <w:t>“</w:t>
+      </w:r>
+      <w:r>
+        <w:t xml:space="preserve">BDC internal </w:t>
+      </w:r>
+      <w:r>
+        <w:t>table containing screen data.</w:t>
+      </w:r>
+    </w:p>
+    <w:p/>
+    <w:p>
+      <w:pPr>
+        <w:pStyle w:val="ListParagraph"/>
+        <w:numPr>
+          <w:ilvl w:val="0"/>
+          <w:numId w:val="3"/>
+        </w:numPr>
+        <w:rPr>
+          <w:b/>
+          <w:bCs/>
+        </w:rPr>
+      </w:pPr>
+      <w:r>
+        <w:rPr>
+          <w:b/>
+          <w:bCs/>
+        </w:rPr>
+        <w:t>3.BDC_CLOSE_GROUP.</w:t>
+      </w:r>
+    </w:p>
+    <w:p>
+      <w:pPr>
+        <w:pStyle w:val="ListParagraph"/>
+        <w:numPr>
+          <w:ilvl w:val="0"/>
+          <w:numId w:val="3"/>
+        </w:numPr>
+      </w:pPr>
+      <w:r>
+        <w:t>BDC_CLOSE_GROUP closes the Batch Input Session so that it can be processed later using transaction SM35.</w:t>
+      </w:r>
+    </w:p>
+    <w:p>
+      <w:pPr>
+        <w:pStyle w:val="ListParagraph"/>
+        <w:numPr>
+          <w:ilvl w:val="0"/>
+          <w:numId w:val="3"/>
+        </w:numPr>
+      </w:pPr>
+      <w:r>
+        <w:t>Syntax:</w:t>
+      </w:r>
+    </w:p>
+    <w:p>
+      <w:pPr>
+        <w:pStyle w:val="ListParagraph"/>
+        <w:numPr>
+          <w:ilvl w:val="0"/>
+          <w:numId w:val="3"/>
+        </w:numPr>
+      </w:pPr>
+      <w:r>
+        <w:t>CALL FUNCTION 'BDC_CLOSE_GROUP'.</w:t>
+      </w:r>
+      <w:r>
+        <w:br/>
+      </w:r>
+    </w:p>
+    <w:p>
+      <w:pPr>
+        <w:pStyle w:val="ListParagraph"/>
+        <w:numPr>
+          <w:ilvl w:val="0"/>
+          <w:numId w:val="3"/>
+        </w:numPr>
+      </w:pPr>
+      <w:r>
+        <w:t>The Session Method uses three function modules: BDC_OPEN_GROUP to create a session, BDC_INSERT to add transaction data into the session, and BDC_CLOSE_GROUP to close the session. After closing, the session is processed using transaction SM35.</w:t>
+      </w:r>
+    </w:p>
+    <w:p>
+      <w:pPr>
+        <w:pStyle w:val="ListParagraph"/>
+        <w:ind w:left="360"/>
+      </w:pPr>
+    </w:p>
+    <w:p>
+      <w:pPr>
+        <w:pStyle w:val="ListParagraph"/>
+        <w:numPr>
+          <w:ilvl w:val="0"/>
+          <w:numId w:val="10"/>
+        </w:numPr>
+      </w:pPr>
+      <w:r>
+        <w:t>what is use of keep,</w:t>
+      </w:r>
+      <w:r>
+        <w:t xml:space="preserve"> </w:t>
+      </w:r>
+      <w:proofErr w:type="spellStart"/>
+      <w:r>
+        <w:t>dest</w:t>
+      </w:r>
+      <w:proofErr w:type="spellEnd"/>
+      <w:r>
+        <w:t>,</w:t>
+      </w:r>
+      <w:r>
+        <w:t xml:space="preserve"> </w:t>
+      </w:r>
+      <w:r>
+        <w:t>group,</w:t>
+      </w:r>
+      <w:r>
+        <w:t xml:space="preserve"> </w:t>
+      </w:r>
+      <w:proofErr w:type="spellStart"/>
+      <w:r>
+        <w:t>hold</w:t>
+      </w:r>
+      <w:r>
+        <w:t>d</w:t>
+      </w:r>
+      <w:r>
+        <w:t>ate</w:t>
+      </w:r>
+      <w:proofErr w:type="spellEnd"/>
+      <w:r>
+        <w:t xml:space="preserve"> in </w:t>
+      </w:r>
+      <w:proofErr w:type="spellStart"/>
+      <w:r>
+        <w:t>bdc_open_group</w:t>
+      </w:r>
+      <w:proofErr w:type="spellEnd"/>
+      <w:r>
+        <w:t>?</w:t>
+      </w:r>
+    </w:p>
+    <w:tbl>
+      <w:tblPr>
+        <w:tblW w:w="0" w:type="auto"/>
+        <w:tblCellSpacing w:w="15" w:type="dxa"/>
+        <w:tblCellMar>
+          <w:top w:w="15" w:type="dxa"/>
+          <w:left w:w="15" w:type="dxa"/>
+          <w:bottom w:w="15" w:type="dxa"/>
+          <w:right w:w="15" w:type="dxa"/>
+        </w:tblCellMar>
+        <w:tblLook w:val="04A0" w:firstRow="1" w:lastRow="0" w:firstColumn="1" w:lastColumn="0" w:noHBand="0" w:noVBand="1"/>
+      </w:tblPr>
+      <w:tblGrid>
+        <w:gridCol w:w="1491"/>
+        <w:gridCol w:w="892"/>
+      </w:tblGrid>
+      <w:tr>
+        <w:trPr>
+          <w:tblCellSpacing w:w="15" w:type="dxa"/>
+        </w:trPr>
+        <w:tc>
+          <w:tcPr>
+            <w:tcW w:w="0" w:type="auto"/>
+            <w:vAlign w:val="center"/>
+            <w:hideMark/>
+          </w:tcPr>
+          <w:p>
+            <w:pPr>
+              <w:pStyle w:val="ListParagraph"/>
+              <w:numPr>
+                <w:ilvl w:val="0"/>
+                <w:numId w:val="3"/>
+              </w:numPr>
+              <w:spacing w:after="0" w:line="240" w:lineRule="auto"/>
+              <w:jc w:val="center"/>
+              <w:rPr>
+                <w:rFonts w:eastAsia="Times New Roman" w:cstheme="minorHAnsi"/>
+                <w:b/>
+                <w:bCs/>
+                <w:kern w:val="0"/>
+                <w:lang w:eastAsia="en-IN" w:bidi="kn-IN"/>
+                <w14:ligatures w14:val="none"/>
+              </w:rPr>
+            </w:pPr>
+            <w:r>
+              <w:rPr>
+                <w:rFonts w:eastAsia="Times New Roman" w:cstheme="minorHAnsi"/>
+                <w:b/>
+                <w:bCs/>
+                <w:kern w:val="0"/>
+                <w:lang w:eastAsia="en-IN" w:bidi="kn-IN"/>
+                <w14:ligatures w14:val="none"/>
+              </w:rPr>
+              <w:t>Parameter</w:t>
+            </w:r>
+          </w:p>
+        </w:tc>
+        <w:tc>
+          <w:tcPr>
+            <w:tcW w:w="0" w:type="auto"/>
+            <w:vAlign w:val="center"/>
+            <w:hideMark/>
+          </w:tcPr>
+          <w:p>
+            <w:pPr>
+              <w:spacing w:after="0" w:line="240" w:lineRule="auto"/>
+              <w:jc w:val="center"/>
+              <w:rPr>
+                <w:rFonts w:eastAsia="Times New Roman" w:cstheme="minorHAnsi"/>
+                <w:b/>
+                <w:bCs/>
+                <w:kern w:val="0"/>
+                <w:lang w:eastAsia="en-IN" w:bidi="kn-IN"/>
+                <w14:ligatures w14:val="none"/>
+              </w:rPr>
+            </w:pPr>
+            <w:r>
+              <w:rPr>
+                <w:rFonts w:eastAsia="Times New Roman" w:cstheme="minorHAnsi"/>
+                <w:b/>
+                <w:bCs/>
+                <w:kern w:val="0"/>
+                <w:lang w:eastAsia="en-IN" w:bidi="kn-IN"/>
+                <w14:ligatures w14:val="none"/>
+              </w:rPr>
+              <w:t>Purpose</w:t>
+            </w:r>
+          </w:p>
+        </w:tc>
+      </w:tr>
+    </w:tbl>
+    <w:p>
+      <w:pPr>
+        <w:spacing w:after="0" w:line="240" w:lineRule="auto"/>
+        <w:rPr>
+          <w:rFonts w:ascii="Times New Roman" w:eastAsia="Times New Roman" w:hAnsi="Times New Roman" w:cs="Times New Roman"/>
+          <w:vanish/>
+          <w:kern w:val="0"/>
+          <w:lang w:eastAsia="en-IN" w:bidi="kn-IN"/>
+          <w14:ligatures w14:val="none"/>
+        </w:rPr>
+      </w:pPr>
+    </w:p>
+    <w:tbl>
+      <w:tblPr>
+        <w:tblW w:w="0" w:type="auto"/>
+        <w:tblCellSpacing w:w="15" w:type="dxa"/>
+        <w:tblCellMar>
+          <w:top w:w="15" w:type="dxa"/>
+          <w:left w:w="15" w:type="dxa"/>
+          <w:bottom w:w="15" w:type="dxa"/>
+          <w:right w:w="15" w:type="dxa"/>
+        </w:tblCellMar>
+        <w:tblLook w:val="04A0" w:firstRow="1" w:lastRow="0" w:firstColumn="1" w:lastColumn="0" w:noHBand="0" w:noVBand="1"/>
+      </w:tblPr>
+      <w:tblGrid>
+        <w:gridCol w:w="794"/>
+        <w:gridCol w:w="7716"/>
+      </w:tblGrid>
+      <w:tr>
+        <w:trPr>
+          <w:tblCellSpacing w:w="15" w:type="dxa"/>
+        </w:trPr>
+        <w:tc>
+          <w:tcPr>
+            <w:tcW w:w="0" w:type="auto"/>
+            <w:vAlign w:val="center"/>
+            <w:hideMark/>
+          </w:tcPr>
+          <w:p>
+            <w:pPr>
+              <w:spacing w:after="0" w:line="240" w:lineRule="auto"/>
+              <w:rPr>
+                <w:rFonts w:eastAsia="Times New Roman" w:cstheme="minorHAnsi"/>
+                <w:kern w:val="0"/>
+                <w:lang w:eastAsia="en-IN" w:bidi="kn-IN"/>
+                <w14:ligatures w14:val="none"/>
+              </w:rPr>
+            </w:pPr>
+            <w:r>
+              <w:rPr>
+                <w:rFonts w:eastAsia="Times New Roman" w:cstheme="minorHAnsi"/>
+                <w:kern w:val="0"/>
+                <w:lang w:eastAsia="en-IN" w:bidi="kn-IN"/>
+                <w14:ligatures w14:val="none"/>
+              </w:rPr>
+              <w:t>GROUP</w:t>
+            </w:r>
+          </w:p>
+        </w:tc>
+        <w:tc>
+          <w:tcPr>
+            <w:tcW w:w="0" w:type="auto"/>
+            <w:vAlign w:val="center"/>
+            <w:hideMark/>
+          </w:tcPr>
+          <w:p>
+            <w:pPr>
+              <w:spacing w:after="0" w:line="240" w:lineRule="auto"/>
+              <w:rPr>
+                <w:rFonts w:eastAsia="Times New Roman" w:cstheme="minorHAnsi"/>
+                <w:kern w:val="0"/>
+                <w:lang w:eastAsia="en-IN" w:bidi="kn-IN"/>
+                <w14:ligatures w14:val="none"/>
+              </w:rPr>
+            </w:pPr>
+            <w:r>
+              <w:rPr>
+                <w:rFonts w:eastAsia="Times New Roman" w:cstheme="minorHAnsi"/>
+                <w:kern w:val="0"/>
+                <w:lang w:eastAsia="en-IN" w:bidi="kn-IN"/>
+                <w14:ligatures w14:val="none"/>
+              </w:rPr>
+              <w:t>Specifies the name of the Batch Input Session. This name is displayed in SM35.</w:t>
+            </w:r>
+          </w:p>
+        </w:tc>
+      </w:tr>
+    </w:tbl>
+    <w:p>
+      <w:pPr>
+        <w:spacing w:after="0" w:line="240" w:lineRule="auto"/>
+        <w:rPr>
+          <w:rFonts w:eastAsia="Times New Roman" w:cstheme="minorHAnsi"/>
+          <w:vanish/>
+          <w:kern w:val="0"/>
+          <w:lang w:eastAsia="en-IN" w:bidi="kn-IN"/>
+          <w14:ligatures w14:val="none"/>
+        </w:rPr>
+      </w:pPr>
+    </w:p>
+    <w:tbl>
+      <w:tblPr>
+        <w:tblW w:w="0" w:type="auto"/>
+        <w:tblCellSpacing w:w="15" w:type="dxa"/>
+        <w:tblCellMar>
+          <w:top w:w="15" w:type="dxa"/>
+          <w:left w:w="15" w:type="dxa"/>
+          <w:bottom w:w="15" w:type="dxa"/>
+          <w:right w:w="15" w:type="dxa"/>
+        </w:tblCellMar>
+        <w:tblLook w:val="04A0" w:firstRow="1" w:lastRow="0" w:firstColumn="1" w:lastColumn="0" w:noHBand="0" w:noVBand="1"/>
+      </w:tblPr>
+      <w:tblGrid>
+        <w:gridCol w:w="559"/>
+        <w:gridCol w:w="8467"/>
+      </w:tblGrid>
+      <w:tr>
+        <w:trPr>
+          <w:tblCellSpacing w:w="15" w:type="dxa"/>
+        </w:trPr>
+        <w:tc>
+          <w:tcPr>
+            <w:tcW w:w="0" w:type="auto"/>
+            <w:vAlign w:val="center"/>
+            <w:hideMark/>
+          </w:tcPr>
+          <w:p>
+            <w:pPr>
+              <w:spacing w:after="0" w:line="240" w:lineRule="auto"/>
+              <w:rPr>
+                <w:rFonts w:eastAsia="Times New Roman" w:cstheme="minorHAnsi"/>
+                <w:kern w:val="0"/>
+                <w:lang w:eastAsia="en-IN" w:bidi="kn-IN"/>
+                <w14:ligatures w14:val="none"/>
+              </w:rPr>
+            </w:pPr>
+            <w:r>
+              <w:rPr>
+                <w:rFonts w:eastAsia="Times New Roman" w:cstheme="minorHAnsi"/>
+                <w:kern w:val="0"/>
+                <w:lang w:eastAsia="en-IN" w:bidi="kn-IN"/>
+                <w14:ligatures w14:val="none"/>
+              </w:rPr>
+              <w:t>KEEP</w:t>
+            </w:r>
+          </w:p>
+        </w:tc>
+        <w:tc>
+          <w:tcPr>
+            <w:tcW w:w="0" w:type="auto"/>
+            <w:vAlign w:val="center"/>
+            <w:hideMark/>
+          </w:tcPr>
+          <w:p>
+            <w:pPr>
+              <w:spacing w:after="0" w:line="240" w:lineRule="auto"/>
+              <w:rPr>
+                <w:rFonts w:eastAsia="Times New Roman" w:cstheme="minorHAnsi"/>
+                <w:kern w:val="0"/>
+                <w:lang w:eastAsia="en-IN" w:bidi="kn-IN"/>
+                <w14:ligatures w14:val="none"/>
+              </w:rPr>
+            </w:pPr>
+            <w:r>
+              <w:rPr>
+                <w:rFonts w:eastAsia="Times New Roman" w:cstheme="minorHAnsi"/>
+                <w:kern w:val="0"/>
+                <w:lang w:eastAsia="en-IN" w:bidi="kn-IN"/>
+                <w14:ligatures w14:val="none"/>
+              </w:rPr>
+              <w:t xml:space="preserve">Determines whether the session is kept after successful processing. </w:t>
+            </w:r>
+            <w:r>
+              <w:rPr>
+                <w:rFonts w:eastAsia="Times New Roman" w:cstheme="minorHAnsi"/>
+                <w:kern w:val="0"/>
+                <w:sz w:val="20"/>
+                <w:szCs w:val="20"/>
+                <w:lang w:eastAsia="en-IN" w:bidi="kn-IN"/>
+                <w14:ligatures w14:val="none"/>
+              </w:rPr>
+              <w:t>'X'</w:t>
+            </w:r>
+            <w:r>
+              <w:rPr>
+                <w:rFonts w:eastAsia="Times New Roman" w:cstheme="minorHAnsi"/>
+                <w:kern w:val="0"/>
+                <w:lang w:eastAsia="en-IN" w:bidi="kn-IN"/>
+                <w14:ligatures w14:val="none"/>
+              </w:rPr>
+              <w:t xml:space="preserve"> = Keep the session, Space = Delete the session after successful execution.</w:t>
+            </w:r>
+          </w:p>
+        </w:tc>
+      </w:tr>
+    </w:tbl>
+    <w:p>
+      <w:pPr>
+        <w:spacing w:after="0" w:line="240" w:lineRule="auto"/>
+        <w:rPr>
+          <w:rFonts w:eastAsia="Times New Roman" w:cstheme="minorHAnsi"/>
+          <w:vanish/>
+          <w:kern w:val="0"/>
+          <w:lang w:eastAsia="en-IN" w:bidi="kn-IN"/>
+          <w14:ligatures w14:val="none"/>
+        </w:rPr>
+      </w:pPr>
+    </w:p>
+    <w:tbl>
+      <w:tblPr>
+        <w:tblW w:w="0" w:type="auto"/>
+        <w:tblCellSpacing w:w="15" w:type="dxa"/>
+        <w:tblCellMar>
+          <w:top w:w="15" w:type="dxa"/>
+          <w:left w:w="15" w:type="dxa"/>
+          <w:bottom w:w="15" w:type="dxa"/>
+          <w:right w:w="15" w:type="dxa"/>
+        </w:tblCellMar>
+        <w:tblLook w:val="04A0" w:firstRow="1" w:lastRow="0" w:firstColumn="1" w:lastColumn="0" w:noHBand="0" w:noVBand="1"/>
+      </w:tblPr>
+      <w:tblGrid>
+        <w:gridCol w:w="568"/>
+        <w:gridCol w:w="8458"/>
+      </w:tblGrid>
+      <w:tr>
+        <w:trPr>
+          <w:tblCellSpacing w:w="15" w:type="dxa"/>
+        </w:trPr>
+        <w:tc>
+          <w:tcPr>
+            <w:tcW w:w="0" w:type="auto"/>
+            <w:vAlign w:val="center"/>
+            <w:hideMark/>
+          </w:tcPr>
+          <w:p>
+            <w:pPr>
+              <w:spacing w:after="0" w:line="240" w:lineRule="auto"/>
+              <w:rPr>
+                <w:rFonts w:eastAsia="Times New Roman" w:cstheme="minorHAnsi"/>
+                <w:kern w:val="0"/>
+                <w:lang w:eastAsia="en-IN" w:bidi="kn-IN"/>
+                <w14:ligatures w14:val="none"/>
+              </w:rPr>
+            </w:pPr>
+            <w:r>
+              <w:rPr>
+                <w:rFonts w:eastAsia="Times New Roman" w:cstheme="minorHAnsi"/>
+                <w:kern w:val="0"/>
+                <w:lang w:eastAsia="en-IN" w:bidi="kn-IN"/>
+                <w14:ligatures w14:val="none"/>
+              </w:rPr>
+              <w:t>DEST</w:t>
+            </w:r>
+          </w:p>
+        </w:tc>
+        <w:tc>
+          <w:tcPr>
+            <w:tcW w:w="0" w:type="auto"/>
+            <w:vAlign w:val="center"/>
+            <w:hideMark/>
+          </w:tcPr>
+          <w:p>
+            <w:pPr>
+              <w:spacing w:after="0" w:line="240" w:lineRule="auto"/>
+              <w:rPr>
+                <w:rFonts w:eastAsia="Times New Roman" w:cstheme="minorHAnsi"/>
+                <w:kern w:val="0"/>
+                <w:lang w:eastAsia="en-IN" w:bidi="kn-IN"/>
+                <w14:ligatures w14:val="none"/>
+              </w:rPr>
+            </w:pPr>
+            <w:r>
+              <w:rPr>
+                <w:rFonts w:eastAsia="Times New Roman" w:cstheme="minorHAnsi"/>
+                <w:kern w:val="0"/>
+                <w:lang w:eastAsia="en-IN" w:bidi="kn-IN"/>
+                <w14:ligatures w14:val="none"/>
+              </w:rPr>
+              <w:t xml:space="preserve">Specifies the destination (application server) where the session should be processed. Usually left blank or set to </w:t>
+            </w:r>
+            <w:r>
+              <w:rPr>
+                <w:rFonts w:eastAsia="Times New Roman" w:cstheme="minorHAnsi"/>
+                <w:kern w:val="0"/>
+                <w:sz w:val="20"/>
+                <w:szCs w:val="20"/>
+                <w:lang w:eastAsia="en-IN" w:bidi="kn-IN"/>
+                <w14:ligatures w14:val="none"/>
+              </w:rPr>
+              <w:t>NONE</w:t>
+            </w:r>
+            <w:r>
+              <w:rPr>
+                <w:rFonts w:eastAsia="Times New Roman" w:cstheme="minorHAnsi"/>
+                <w:kern w:val="0"/>
+                <w:lang w:eastAsia="en-IN" w:bidi="kn-IN"/>
+                <w14:ligatures w14:val="none"/>
+              </w:rPr>
+              <w:t xml:space="preserve"> for local processing.</w:t>
+            </w:r>
+          </w:p>
+        </w:tc>
+      </w:tr>
+    </w:tbl>
+    <w:p>
+      <w:pPr>
+        <w:spacing w:after="0" w:line="240" w:lineRule="auto"/>
+        <w:rPr>
+          <w:rFonts w:eastAsia="Times New Roman" w:cstheme="minorHAnsi"/>
+          <w:vanish/>
+          <w:kern w:val="0"/>
+          <w:lang w:eastAsia="en-IN" w:bidi="kn-IN"/>
+          <w14:ligatures w14:val="none"/>
+        </w:rPr>
+      </w:pPr>
+    </w:p>
+    <w:tbl>
+      <w:tblPr>
+        <w:tblW w:w="0" w:type="auto"/>
+        <w:tblCellSpacing w:w="15" w:type="dxa"/>
+        <w:tblCellMar>
+          <w:top w:w="15" w:type="dxa"/>
+          <w:left w:w="15" w:type="dxa"/>
+          <w:bottom w:w="15" w:type="dxa"/>
+          <w:right w:w="15" w:type="dxa"/>
+        </w:tblCellMar>
+        <w:tblLook w:val="04A0" w:firstRow="1" w:lastRow="0" w:firstColumn="1" w:lastColumn="0" w:noHBand="0" w:noVBand="1"/>
+      </w:tblPr>
+      <w:tblGrid>
+        <w:gridCol w:w="1153"/>
+        <w:gridCol w:w="7873"/>
+      </w:tblGrid>
+      <w:tr>
+        <w:trPr>
+          <w:tblCellSpacing w:w="15" w:type="dxa"/>
+        </w:trPr>
+        <w:tc>
+          <w:tcPr>
+            <w:tcW w:w="0" w:type="auto"/>
+            <w:vAlign w:val="center"/>
+            <w:hideMark/>
+          </w:tcPr>
+          <w:p>
+            <w:pPr>
+              <w:spacing w:after="0" w:line="240" w:lineRule="auto"/>
+              <w:rPr>
+                <w:rFonts w:eastAsia="Times New Roman" w:cstheme="minorHAnsi"/>
+                <w:kern w:val="0"/>
+                <w:lang w:eastAsia="en-IN" w:bidi="kn-IN"/>
+                <w14:ligatures w14:val="none"/>
+              </w:rPr>
+            </w:pPr>
+            <w:r>
+              <w:rPr>
+                <w:rFonts w:eastAsia="Times New Roman" w:cstheme="minorHAnsi"/>
+                <w:kern w:val="0"/>
+                <w:lang w:eastAsia="en-IN" w:bidi="kn-IN"/>
+                <w14:ligatures w14:val="none"/>
+              </w:rPr>
+              <w:t>HOLDDATE</w:t>
+            </w:r>
+          </w:p>
+        </w:tc>
+        <w:tc>
+          <w:tcPr>
+            <w:tcW w:w="0" w:type="auto"/>
+            <w:vAlign w:val="center"/>
+            <w:hideMark/>
+          </w:tcPr>
+          <w:p>
+            <w:pPr>
+              <w:spacing w:after="0" w:line="240" w:lineRule="auto"/>
+              <w:rPr>
+                <w:rFonts w:eastAsia="Times New Roman" w:cstheme="minorHAnsi"/>
+                <w:kern w:val="0"/>
+                <w:lang w:eastAsia="en-IN" w:bidi="kn-IN"/>
+                <w14:ligatures w14:val="none"/>
+              </w:rPr>
+            </w:pPr>
+            <w:r>
+              <w:rPr>
+                <w:rFonts w:eastAsia="Times New Roman" w:cstheme="minorHAnsi"/>
+                <w:kern w:val="0"/>
+                <w:lang w:eastAsia="en-IN" w:bidi="kn-IN"/>
+                <w14:ligatures w14:val="none"/>
+              </w:rPr>
+              <w:t>Specifies the date on which the session becomes available for processing. Until that date, the session remains on hold and cannot be processed in SM35.</w:t>
+            </w:r>
+          </w:p>
+        </w:tc>
+      </w:tr>
+    </w:tbl>
+    <w:p/>
     <w:sectPr>
       <w:pgSz w:w="11906" w:h="16838"/>
       <w:pgMar w:top="1440" w:right="1440" w:bottom="1440" w:left="1440" w:header="708" w:footer="708" w:gutter="0"/>
@@ -3771,6 +5916,95 @@
     </w:lvl>
   </w:abstractNum>
   <w:abstractNum w:abstractNumId="5" w15:restartNumberingAfterBreak="0">
+    <w:nsid w:val="648465C4"/>
+    <w:multiLevelType w:val="hybridMultilevel"/>
+    <w:tmpl w:val="3DE0096C"/>
+    <w:lvl w:ilvl="0" w:tplc="4009000F">
+      <w:start w:val="1"/>
+      <w:numFmt w:val="decimal"/>
+      <w:lvlText w:val="%1."/>
+      <w:lvlJc w:val="left"/>
+      <w:pPr>
+        <w:ind w:left="360" w:hanging="360"/>
+      </w:pPr>
+      <w:rPr>
+        <w:rFonts w:hint="default"/>
+      </w:rPr>
+    </w:lvl>
+    <w:lvl w:ilvl="1" w:tplc="40090019" w:tentative="1">
+      <w:start w:val="1"/>
+      <w:numFmt w:val="lowerLetter"/>
+      <w:lvlText w:val="%2."/>
+      <w:lvlJc w:val="left"/>
+      <w:pPr>
+        <w:ind w:left="1080" w:hanging="360"/>
+      </w:pPr>
+    </w:lvl>
+    <w:lvl w:ilvl="2" w:tplc="4009001B" w:tentative="1">
+      <w:start w:val="1"/>
+      <w:numFmt w:val="lowerRoman"/>
+      <w:lvlText w:val="%3."/>
+      <w:lvlJc w:val="right"/>
+      <w:pPr>
+        <w:ind w:left="1800" w:hanging="180"/>
+      </w:pPr>
+    </w:lvl>
+    <w:lvl w:ilvl="3" w:tplc="4009000F" w:tentative="1">
+      <w:start w:val="1"/>
+      <w:numFmt w:val="decimal"/>
+      <w:lvlText w:val="%4."/>
+      <w:lvlJc w:val="left"/>
+      <w:pPr>
+        <w:ind w:left="2520" w:hanging="360"/>
+      </w:pPr>
+    </w:lvl>
+    <w:lvl w:ilvl="4" w:tplc="40090019" w:tentative="1">
+      <w:start w:val="1"/>
+      <w:numFmt w:val="lowerLetter"/>
+      <w:lvlText w:val="%5."/>
+      <w:lvlJc w:val="left"/>
+      <w:pPr>
+        <w:ind w:left="3240" w:hanging="360"/>
+      </w:pPr>
+    </w:lvl>
+    <w:lvl w:ilvl="5" w:tplc="4009001B" w:tentative="1">
+      <w:start w:val="1"/>
+      <w:numFmt w:val="lowerRoman"/>
+      <w:lvlText w:val="%6."/>
+      <w:lvlJc w:val="right"/>
+      <w:pPr>
+        <w:ind w:left="3960" w:hanging="180"/>
+      </w:pPr>
+    </w:lvl>
+    <w:lvl w:ilvl="6" w:tplc="4009000F" w:tentative="1">
+      <w:start w:val="1"/>
+      <w:numFmt w:val="decimal"/>
+      <w:lvlText w:val="%7."/>
+      <w:lvlJc w:val="left"/>
+      <w:pPr>
+        <w:ind w:left="4680" w:hanging="360"/>
+      </w:pPr>
+    </w:lvl>
+    <w:lvl w:ilvl="7" w:tplc="40090019" w:tentative="1">
+      <w:start w:val="1"/>
+      <w:numFmt w:val="lowerLetter"/>
+      <w:lvlText w:val="%8."/>
+      <w:lvlJc w:val="left"/>
+      <w:pPr>
+        <w:ind w:left="5400" w:hanging="360"/>
+      </w:pPr>
+    </w:lvl>
+    <w:lvl w:ilvl="8" w:tplc="4009001B" w:tentative="1">
+      <w:start w:val="1"/>
+      <w:numFmt w:val="lowerRoman"/>
+      <w:lvlText w:val="%9."/>
+      <w:lvlJc w:val="right"/>
+      <w:pPr>
+        <w:ind w:left="6120" w:hanging="180"/>
+      </w:pPr>
+    </w:lvl>
+  </w:abstractNum>
+  <w:abstractNum w:abstractNumId="6" w15:restartNumberingAfterBreak="0">
     <w:nsid w:val="64E26DF6"/>
     <w:multiLevelType w:val="hybridMultilevel"/>
     <w:tmpl w:val="CB9A8952"/>
@@ -3859,7 +6093,7 @@
       </w:pPr>
     </w:lvl>
   </w:abstractNum>
-  <w:abstractNum w:abstractNumId="6" w15:restartNumberingAfterBreak="0">
+  <w:abstractNum w:abstractNumId="7" w15:restartNumberingAfterBreak="0">
     <w:nsid w:val="69121C0E"/>
     <w:multiLevelType w:val="hybridMultilevel"/>
     <w:tmpl w:val="0A3C0364"/>
@@ -3875,7 +6109,7 @@
         <w:rFonts w:ascii="Wingdings" w:eastAsiaTheme="minorHAnsi" w:hAnsi="Wingdings" w:cstheme="minorBidi" w:hint="default"/>
       </w:rPr>
     </w:lvl>
-    <w:lvl w:ilvl="1" w:tplc="40090003" w:tentative="1">
+    <w:lvl w:ilvl="1" w:tplc="40090003">
       <w:start w:val="1"/>
       <w:numFmt w:val="bullet"/>
       <w:lvlText w:val="o"/>
@@ -3972,7 +6206,7 @@
       </w:rPr>
     </w:lvl>
   </w:abstractNum>
-  <w:abstractNum w:abstractNumId="7" w15:restartNumberingAfterBreak="0">
+  <w:abstractNum w:abstractNumId="8" w15:restartNumberingAfterBreak="0">
     <w:nsid w:val="709A07D7"/>
     <w:multiLevelType w:val="multilevel"/>
     <w:tmpl w:val="018EF194"/>
@@ -4089,7 +6323,7 @@
       </w:pPr>
     </w:lvl>
   </w:abstractNum>
-  <w:abstractNum w:abstractNumId="8" w15:restartNumberingAfterBreak="0">
+  <w:abstractNum w:abstractNumId="9" w15:restartNumberingAfterBreak="0">
     <w:nsid w:val="7429110E"/>
     <w:multiLevelType w:val="multilevel"/>
     <w:tmpl w:val="E584A426"/>
@@ -4238,32 +6472,35 @@
       </w:rPr>
     </w:lvl>
   </w:abstractNum>
-  <w:num w:numId="1" w16cid:durableId="806361031">
-    <w:abstractNumId w:val="5"/>
+  <w:num w:numId="1" w16cid:durableId="1320621938">
+    <w:abstractNumId w:val="1"/>
   </w:num>
-  <w:num w:numId="2" w16cid:durableId="1684743668">
-    <w:abstractNumId w:val="6"/>
-  </w:num>
-  <w:num w:numId="3" w16cid:durableId="1648627454">
+  <w:num w:numId="2" w16cid:durableId="1648627454">
     <w:abstractNumId w:val="4"/>
   </w:num>
-  <w:num w:numId="4" w16cid:durableId="1320621938">
-    <w:abstractNumId w:val="1"/>
+  <w:num w:numId="3" w16cid:durableId="1684743668">
+    <w:abstractNumId w:val="7"/>
   </w:num>
-  <w:num w:numId="5" w16cid:durableId="1691834344">
-    <w:abstractNumId w:val="8"/>
+  <w:num w:numId="4" w16cid:durableId="1691834344">
+    <w:abstractNumId w:val="9"/>
+  </w:num>
+  <w:num w:numId="5" w16cid:durableId="1886213795">
+    <w:abstractNumId w:val="2"/>
   </w:num>
   <w:num w:numId="6" w16cid:durableId="651641685">
     <w:abstractNumId w:val="3"/>
   </w:num>
-  <w:num w:numId="7" w16cid:durableId="742719716">
-    <w:abstractNumId w:val="7"/>
+  <w:num w:numId="7" w16cid:durableId="70666124">
+    <w:abstractNumId w:val="0"/>
   </w:num>
-  <w:num w:numId="8" w16cid:durableId="1886213795">
-    <w:abstractNumId w:val="2"/>
+  <w:num w:numId="8" w16cid:durableId="742719716">
+    <w:abstractNumId w:val="8"/>
   </w:num>
-  <w:num w:numId="9" w16cid:durableId="70666124">
-    <w:abstractNumId w:val="0"/>
+  <w:num w:numId="9" w16cid:durableId="806361031">
+    <w:abstractNumId w:val="6"/>
+  </w:num>
+  <w:num w:numId="10" w16cid:durableId="1648241073">
+    <w:abstractNumId w:val="5"/>
   </w:num>
 </w:numbering>
 </file>
@@ -4871,7 +7108,6 @@
   <w:style w:type="character" w:default="1" w:styleId="DefaultParagraphFont">
     <w:name w:val="Default Paragraph Font"/>
     <w:uiPriority w:val="1"/>
-    <w:semiHidden/>
     <w:unhideWhenUsed/>
   </w:style>
   <w:style w:type="table" w:default="1" w:styleId="TableNormal">
@@ -5204,6 +7440,30 @@
       </w:tblBorders>
     </w:tblPr>
   </w:style>
+  <w:style w:type="character" w:styleId="Strong">
+    <w:name w:val="Strong"/>
+    <w:basedOn w:val="DefaultParagraphFont"/>
+    <w:uiPriority w:val="22"/>
+    <w:qFormat/>
+    <w:rsid w:val="003008D5"/>
+    <w:rPr>
+      <w:b/>
+      <w:bCs/>
+    </w:rPr>
+  </w:style>
+  <w:style w:type="character" w:styleId="HTMLCode">
+    <w:name w:val="HTML Code"/>
+    <w:basedOn w:val="DefaultParagraphFont"/>
+    <w:uiPriority w:val="99"/>
+    <w:semiHidden/>
+    <w:unhideWhenUsed/>
+    <w:rsid w:val="003008D5"/>
+    <w:rPr>
+      <w:rFonts w:ascii="Courier New" w:eastAsia="Times New Roman" w:hAnsi="Courier New" w:cs="Courier New"/>
+      <w:sz w:val="20"/>
+      <w:szCs w:val="20"/>
+    </w:rPr>
+  </w:style>
 </w:styles>
 </file>
 

</xml_diff>